<commit_message>
Add the redesigned profile area as a switchable second skin
Builds the Tamasha Profile designs: left profile card carrying its own
nav (Subscriptions Plan, Payment & Membership, Billing Details, Terms)
and a right pane with the six views those exports cover — account
summary, plan details, payment history table, transaction detail with
its successful and failed states, and the invoice.

Runs alongside the original rather than replacing it. A Classic / New
design switch sits at the top of the account screen in both skins and
persists; ?skin=v2 sets it for a deep link. The two use different view
names, so openAccount normalises whichever it is handed to a view the
active skin can actually render.

Real ACCOUNT, PLANS and BILLING data throughout — the history table and
transaction pages read the same four records the classic billing screen
does, including the coupon row.

Co-Authored-By: Claude Opus 5 <noreply@anthropic.com>
</commit_message>
<xml_diff>
--- a/Tamasha Screen Inventory.docx
+++ b/Tamasha Screen Inventory.docx
@@ -14437,12 +14437,12 @@
           <w:sz w:val="21"/>
           <w:szCs w:val="21"/>
         </w:rPr>
-        <w:t xml:space="preserve">Fastest way to start</w:t>
+        <w:t xml:space="preserve">Importing the current UI</w:t>
       </w:r>
     </w:p>
     <w:p>
       <w:pPr>
-        <w:spacing w:after="200" w:before="0" w:line="276"/>
+        <w:spacing w:after="90" w:before="0" w:line="276"/>
       </w:pPr>
       <w:r>
         <w:rPr>
@@ -14451,7 +14451,2543 @@
           <w:sz w:val="20"/>
           <w:szCs w:val="20"/>
         </w:rPr>
-        <w:t xml:space="preserve">Rather than redrawing the current UI by hand, import it. The html.to.design plugin will pull https://tamashaweb-d80c4.web.app straight into Figma as editable layers — that gives the designer the existing 53 surfaces as a baseline to redesign against, instead of a blank canvas. Import each breakpoint separately; overlays need to be opened on the page first, since the plugin captures what is rendered.</w:t>
+        <w:t xml:space="preserve">Rather than redrawing what exists, import it. The html.to.design plugin pulls a URL into Figma as editable layers. Importing the site root only ever yields the homepage, though — every other screen is an overlay drawn on top of it, with no address of its own to fetch.</w:t>
+      </w:r>
+    </w:p>
+    <w:p>
+      <w:pPr>
+        <w:spacing w:after="160" w:before="0" w:line="276"/>
+      </w:pPr>
+      <w:r>
+        <w:rPr>
+          <w:rFonts w:ascii="Calibri" w:cs="Calibri" w:eastAsia="Calibri" w:hAnsi="Calibri"/>
+          <w:color w:val="4C5468"/>
+          <w:sz w:val="20"/>
+          <w:szCs w:val="20"/>
+        </w:rPr>
+        <w:t xml:space="preserve">So each one now has a URL. Paste any of these into the plugin and it lands on that screen directly, with the loader and skeleton skipped so the capture gets the screen rather than the splash. Add the tier before importing where it matters — a homepage as a guest has no Continue Watching row, and as a PRO member has no ads or locks.</w:t>
+      </w:r>
+    </w:p>
+    <w:tbl>
+      <w:tblPr>
+        <w:tblW w:type="dxa" w:w="9360"/>
+        <w:tblBorders>
+          <w:top w:val="single" w:color="auto" w:sz="4"/>
+          <w:left w:val="single" w:color="auto" w:sz="4"/>
+          <w:bottom w:val="single" w:color="auto" w:sz="4"/>
+          <w:right w:val="single" w:color="auto" w:sz="4"/>
+          <w:insideH w:val="single" w:color="auto" w:sz="4"/>
+          <w:insideV w:val="single" w:color="auto" w:sz="4"/>
+        </w:tblBorders>
+      </w:tblPr>
+      <w:tblGrid>
+        <w:gridCol w:w="3200"/>
+        <w:gridCol w:w="6160"/>
+      </w:tblGrid>
+      <w:tr>
+        <w:trPr>
+          <w:tblHeader/>
+        </w:trPr>
+        <w:tc>
+          <w:tcPr>
+            <w:tcW w:type="dxa" w:w="3200"/>
+            <w:tcBorders>
+              <w:top w:val="single" w:color="DBDFE8" w:sz="2"/>
+              <w:left w:val="none"/>
+              <w:bottom w:val="single" w:color="DBDFE8" w:sz="2"/>
+              <w:right w:val="none"/>
+            </w:tcBorders>
+            <w:shd w:fill="EEF2FA" w:color="auto" w:val="clear"/>
+            <w:tcMar>
+              <w:top w:type="dxa" w:w="90"/>
+              <w:left w:type="dxa" w:w="110"/>
+              <w:bottom w:type="dxa" w:w="90"/>
+              <w:right w:type="dxa" w:w="110"/>
+            </w:tcMar>
+          </w:tcPr>
+          <w:p>
+            <w:pPr>
+              <w:spacing w:after="0" w:before="0" w:line="276"/>
+            </w:pPr>
+            <w:r>
+              <w:rPr>
+                <w:rFonts w:ascii="Calibri" w:cs="Calibri" w:eastAsia="Calibri" w:hAnsi="Calibri"/>
+                <w:b/>
+                <w:bCs/>
+                <w:caps/>
+                <w:color w:val="4C5468"/>
+                <w:spacing w:val="12"/>
+                <w:sz w:val="17"/>
+                <w:szCs w:val="17"/>
+              </w:rPr>
+              <w:t xml:space="preserve">Screen</w:t>
+            </w:r>
+          </w:p>
+        </w:tc>
+        <w:tc>
+          <w:tcPr>
+            <w:tcW w:type="dxa" w:w="6160"/>
+            <w:tcBorders>
+              <w:top w:val="single" w:color="DBDFE8" w:sz="2"/>
+              <w:left w:val="none"/>
+              <w:bottom w:val="single" w:color="DBDFE8" w:sz="2"/>
+              <w:right w:val="none"/>
+            </w:tcBorders>
+            <w:shd w:fill="EEF2FA" w:color="auto" w:val="clear"/>
+            <w:tcMar>
+              <w:top w:type="dxa" w:w="90"/>
+              <w:left w:type="dxa" w:w="110"/>
+              <w:bottom w:type="dxa" w:w="90"/>
+              <w:right w:type="dxa" w:w="110"/>
+            </w:tcMar>
+          </w:tcPr>
+          <w:p>
+            <w:pPr>
+              <w:spacing w:after="0" w:before="0" w:line="276"/>
+            </w:pPr>
+            <w:r>
+              <w:rPr>
+                <w:rFonts w:ascii="Calibri" w:cs="Calibri" w:eastAsia="Calibri" w:hAnsi="Calibri"/>
+                <w:b/>
+                <w:bCs/>
+                <w:caps/>
+                <w:color w:val="4C5468"/>
+                <w:spacing w:val="12"/>
+                <w:sz w:val="17"/>
+                <w:szCs w:val="17"/>
+              </w:rPr>
+              <w:t xml:space="preserve">Append to https://tamashaweb-d80c4.web.app/</w:t>
+            </w:r>
+          </w:p>
+        </w:tc>
+      </w:tr>
+      <w:tr>
+        <w:tc>
+          <w:tcPr>
+            <w:tcW w:type="dxa" w:w="3200"/>
+            <w:tcBorders>
+              <w:top w:val="single" w:color="DBDFE8" w:sz="2"/>
+              <w:left w:val="none"/>
+              <w:bottom w:val="single" w:color="DBDFE8" w:sz="2"/>
+              <w:right w:val="none"/>
+            </w:tcBorders>
+            <w:tcMar>
+              <w:top w:type="dxa" w:w="90"/>
+              <w:left w:type="dxa" w:w="110"/>
+              <w:bottom w:type="dxa" w:w="90"/>
+              <w:right w:type="dxa" w:w="110"/>
+            </w:tcMar>
+          </w:tcPr>
+          <w:p>
+            <w:pPr>
+              <w:spacing w:after="0" w:before="0" w:line="276"/>
+            </w:pPr>
+            <w:r>
+              <w:rPr>
+                <w:rFonts w:ascii="Calibri" w:cs="Calibri" w:eastAsia="Calibri" w:hAnsi="Calibri"/>
+                <w:b/>
+                <w:bCs/>
+                <w:color w:val="161A23"/>
+                <w:sz w:val="19"/>
+                <w:szCs w:val="19"/>
+              </w:rPr>
+              <w:t xml:space="preserve">Home — guest</w:t>
+            </w:r>
+          </w:p>
+        </w:tc>
+        <w:tc>
+          <w:tcPr>
+            <w:tcW w:type="dxa" w:w="6160"/>
+            <w:tcBorders>
+              <w:top w:val="single" w:color="DBDFE8" w:sz="2"/>
+              <w:left w:val="none"/>
+              <w:bottom w:val="single" w:color="DBDFE8" w:sz="2"/>
+              <w:right w:val="none"/>
+            </w:tcBorders>
+            <w:tcMar>
+              <w:top w:type="dxa" w:w="90"/>
+              <w:left w:type="dxa" w:w="110"/>
+              <w:bottom w:type="dxa" w:w="90"/>
+              <w:right w:type="dxa" w:w="110"/>
+            </w:tcMar>
+          </w:tcPr>
+          <w:p>
+            <w:pPr>
+              <w:spacing w:after="0" w:before="0" w:line="276"/>
+            </w:pPr>
+            <w:r>
+              <w:rPr>
+                <w:rFonts w:ascii="Consolas" w:cs="Consolas" w:eastAsia="Consolas" w:hAnsi="Consolas"/>
+                <w:color w:val="1B5FD9"/>
+                <w:sz w:val="18"/>
+                <w:szCs w:val="18"/>
+              </w:rPr>
+              <w:t xml:space="preserve">?tier=guest</w:t>
+            </w:r>
+          </w:p>
+        </w:tc>
+      </w:tr>
+      <w:tr>
+        <w:tc>
+          <w:tcPr>
+            <w:tcW w:type="dxa" w:w="3200"/>
+            <w:tcBorders>
+              <w:top w:val="single" w:color="DBDFE8" w:sz="2"/>
+              <w:left w:val="none"/>
+              <w:bottom w:val="single" w:color="DBDFE8" w:sz="2"/>
+              <w:right w:val="none"/>
+            </w:tcBorders>
+            <w:shd w:fill="F7F8FA" w:color="auto" w:val="clear"/>
+            <w:tcMar>
+              <w:top w:type="dxa" w:w="90"/>
+              <w:left w:type="dxa" w:w="110"/>
+              <w:bottom w:type="dxa" w:w="90"/>
+              <w:right w:type="dxa" w:w="110"/>
+            </w:tcMar>
+          </w:tcPr>
+          <w:p>
+            <w:pPr>
+              <w:spacing w:after="0" w:before="0" w:line="276"/>
+            </w:pPr>
+            <w:r>
+              <w:rPr>
+                <w:rFonts w:ascii="Calibri" w:cs="Calibri" w:eastAsia="Calibri" w:hAnsi="Calibri"/>
+                <w:b/>
+                <w:bCs/>
+                <w:color w:val="161A23"/>
+                <w:sz w:val="19"/>
+                <w:szCs w:val="19"/>
+              </w:rPr>
+              <w:t xml:space="preserve">Home — AVOD</w:t>
+            </w:r>
+          </w:p>
+        </w:tc>
+        <w:tc>
+          <w:tcPr>
+            <w:tcW w:type="dxa" w:w="6160"/>
+            <w:tcBorders>
+              <w:top w:val="single" w:color="DBDFE8" w:sz="2"/>
+              <w:left w:val="none"/>
+              <w:bottom w:val="single" w:color="DBDFE8" w:sz="2"/>
+              <w:right w:val="none"/>
+            </w:tcBorders>
+            <w:shd w:fill="F7F8FA" w:color="auto" w:val="clear"/>
+            <w:tcMar>
+              <w:top w:type="dxa" w:w="90"/>
+              <w:left w:type="dxa" w:w="110"/>
+              <w:bottom w:type="dxa" w:w="90"/>
+              <w:right w:type="dxa" w:w="110"/>
+            </w:tcMar>
+          </w:tcPr>
+          <w:p>
+            <w:pPr>
+              <w:spacing w:after="0" w:before="0" w:line="276"/>
+            </w:pPr>
+            <w:r>
+              <w:rPr>
+                <w:rFonts w:ascii="Consolas" w:cs="Consolas" w:eastAsia="Consolas" w:hAnsi="Consolas"/>
+                <w:color w:val="1B5FD9"/>
+                <w:sz w:val="18"/>
+                <w:szCs w:val="18"/>
+              </w:rPr>
+              <w:t xml:space="preserve">?tier=avod</w:t>
+            </w:r>
+          </w:p>
+        </w:tc>
+      </w:tr>
+      <w:tr>
+        <w:tc>
+          <w:tcPr>
+            <w:tcW w:type="dxa" w:w="3200"/>
+            <w:tcBorders>
+              <w:top w:val="single" w:color="DBDFE8" w:sz="2"/>
+              <w:left w:val="none"/>
+              <w:bottom w:val="single" w:color="DBDFE8" w:sz="2"/>
+              <w:right w:val="none"/>
+            </w:tcBorders>
+            <w:tcMar>
+              <w:top w:type="dxa" w:w="90"/>
+              <w:left w:type="dxa" w:w="110"/>
+              <w:bottom w:type="dxa" w:w="90"/>
+              <w:right w:type="dxa" w:w="110"/>
+            </w:tcMar>
+          </w:tcPr>
+          <w:p>
+            <w:pPr>
+              <w:spacing w:after="0" w:before="0" w:line="276"/>
+            </w:pPr>
+            <w:r>
+              <w:rPr>
+                <w:rFonts w:ascii="Calibri" w:cs="Calibri" w:eastAsia="Calibri" w:hAnsi="Calibri"/>
+                <w:b/>
+                <w:bCs/>
+                <w:color w:val="161A23"/>
+                <w:sz w:val="19"/>
+                <w:szCs w:val="19"/>
+              </w:rPr>
+              <w:t xml:space="preserve">Home — PRO (no ads, no locks)</w:t>
+            </w:r>
+          </w:p>
+        </w:tc>
+        <w:tc>
+          <w:tcPr>
+            <w:tcW w:type="dxa" w:w="6160"/>
+            <w:tcBorders>
+              <w:top w:val="single" w:color="DBDFE8" w:sz="2"/>
+              <w:left w:val="none"/>
+              <w:bottom w:val="single" w:color="DBDFE8" w:sz="2"/>
+              <w:right w:val="none"/>
+            </w:tcBorders>
+            <w:tcMar>
+              <w:top w:type="dxa" w:w="90"/>
+              <w:left w:type="dxa" w:w="110"/>
+              <w:bottom w:type="dxa" w:w="90"/>
+              <w:right w:type="dxa" w:w="110"/>
+            </w:tcMar>
+          </w:tcPr>
+          <w:p>
+            <w:pPr>
+              <w:spacing w:after="0" w:before="0" w:line="276"/>
+            </w:pPr>
+            <w:r>
+              <w:rPr>
+                <w:rFonts w:ascii="Consolas" w:cs="Consolas" w:eastAsia="Consolas" w:hAnsi="Consolas"/>
+                <w:color w:val="1B5FD9"/>
+                <w:sz w:val="18"/>
+                <w:szCs w:val="18"/>
+              </w:rPr>
+              <w:t xml:space="preserve">?tier=pro</w:t>
+            </w:r>
+          </w:p>
+        </w:tc>
+      </w:tr>
+      <w:tr>
+        <w:tc>
+          <w:tcPr>
+            <w:tcW w:type="dxa" w:w="3200"/>
+            <w:tcBorders>
+              <w:top w:val="single" w:color="DBDFE8" w:sz="2"/>
+              <w:left w:val="none"/>
+              <w:bottom w:val="single" w:color="DBDFE8" w:sz="2"/>
+              <w:right w:val="none"/>
+            </w:tcBorders>
+            <w:shd w:fill="F7F8FA" w:color="auto" w:val="clear"/>
+            <w:tcMar>
+              <w:top w:type="dxa" w:w="90"/>
+              <w:left w:type="dxa" w:w="110"/>
+              <w:bottom w:type="dxa" w:w="90"/>
+              <w:right w:type="dxa" w:w="110"/>
+            </w:tcMar>
+          </w:tcPr>
+          <w:p>
+            <w:pPr>
+              <w:spacing w:after="0" w:before="0" w:line="276"/>
+            </w:pPr>
+            <w:r>
+              <w:rPr>
+                <w:rFonts w:ascii="Calibri" w:cs="Calibri" w:eastAsia="Calibri" w:hAnsi="Calibri"/>
+                <w:b/>
+                <w:bCs/>
+                <w:color w:val="161A23"/>
+                <w:sz w:val="19"/>
+                <w:szCs w:val="19"/>
+              </w:rPr>
+              <w:t xml:space="preserve">Login popup</w:t>
+            </w:r>
+          </w:p>
+        </w:tc>
+        <w:tc>
+          <w:tcPr>
+            <w:tcW w:type="dxa" w:w="6160"/>
+            <w:tcBorders>
+              <w:top w:val="single" w:color="DBDFE8" w:sz="2"/>
+              <w:left w:val="none"/>
+              <w:bottom w:val="single" w:color="DBDFE8" w:sz="2"/>
+              <w:right w:val="none"/>
+            </w:tcBorders>
+            <w:shd w:fill="F7F8FA" w:color="auto" w:val="clear"/>
+            <w:tcMar>
+              <w:top w:type="dxa" w:w="90"/>
+              <w:left w:type="dxa" w:w="110"/>
+              <w:bottom w:type="dxa" w:w="90"/>
+              <w:right w:type="dxa" w:w="110"/>
+            </w:tcMar>
+          </w:tcPr>
+          <w:p>
+            <w:pPr>
+              <w:spacing w:after="0" w:before="0" w:line="276"/>
+            </w:pPr>
+            <w:r>
+              <w:rPr>
+                <w:rFonts w:ascii="Consolas" w:cs="Consolas" w:eastAsia="Consolas" w:hAnsi="Consolas"/>
+                <w:color w:val="1B5FD9"/>
+                <w:sz w:val="18"/>
+                <w:szCs w:val="18"/>
+              </w:rPr>
+              <w:t xml:space="preserve">?screen=login</w:t>
+            </w:r>
+          </w:p>
+        </w:tc>
+      </w:tr>
+      <w:tr>
+        <w:tc>
+          <w:tcPr>
+            <w:tcW w:type="dxa" w:w="3200"/>
+            <w:tcBorders>
+              <w:top w:val="single" w:color="DBDFE8" w:sz="2"/>
+              <w:left w:val="none"/>
+              <w:bottom w:val="single" w:color="DBDFE8" w:sz="2"/>
+              <w:right w:val="none"/>
+            </w:tcBorders>
+            <w:tcMar>
+              <w:top w:type="dxa" w:w="90"/>
+              <w:left w:type="dxa" w:w="110"/>
+              <w:bottom w:type="dxa" w:w="90"/>
+              <w:right w:type="dxa" w:w="110"/>
+            </w:tcMar>
+          </w:tcPr>
+          <w:p>
+            <w:pPr>
+              <w:spacing w:after="0" w:before="0" w:line="276"/>
+            </w:pPr>
+            <w:r>
+              <w:rPr>
+                <w:rFonts w:ascii="Calibri" w:cs="Calibri" w:eastAsia="Calibri" w:hAnsi="Calibri"/>
+                <w:b/>
+                <w:bCs/>
+                <w:color w:val="161A23"/>
+                <w:sz w:val="19"/>
+                <w:szCs w:val="19"/>
+              </w:rPr>
+              <w:t xml:space="preserve">Movie detail</w:t>
+            </w:r>
+          </w:p>
+        </w:tc>
+        <w:tc>
+          <w:tcPr>
+            <w:tcW w:type="dxa" w:w="6160"/>
+            <w:tcBorders>
+              <w:top w:val="single" w:color="DBDFE8" w:sz="2"/>
+              <w:left w:val="none"/>
+              <w:bottom w:val="single" w:color="DBDFE8" w:sz="2"/>
+              <w:right w:val="none"/>
+            </w:tcBorders>
+            <w:tcMar>
+              <w:top w:type="dxa" w:w="90"/>
+              <w:left w:type="dxa" w:w="110"/>
+              <w:bottom w:type="dxa" w:w="90"/>
+              <w:right w:type="dxa" w:w="110"/>
+            </w:tcMar>
+          </w:tcPr>
+          <w:p>
+            <w:pPr>
+              <w:spacing w:after="0" w:before="0" w:line="276"/>
+            </w:pPr>
+            <w:r>
+              <w:rPr>
+                <w:rFonts w:ascii="Consolas" w:cs="Consolas" w:eastAsia="Consolas" w:hAnsi="Consolas"/>
+                <w:color w:val="1B5FD9"/>
+                <w:sz w:val="18"/>
+                <w:szCs w:val="18"/>
+              </w:rPr>
+              <w:t xml:space="preserve">?screen=detail&amp;kind=movie&amp;i=0</w:t>
+            </w:r>
+          </w:p>
+        </w:tc>
+      </w:tr>
+      <w:tr>
+        <w:tc>
+          <w:tcPr>
+            <w:tcW w:type="dxa" w:w="3200"/>
+            <w:tcBorders>
+              <w:top w:val="single" w:color="DBDFE8" w:sz="2"/>
+              <w:left w:val="none"/>
+              <w:bottom w:val="single" w:color="DBDFE8" w:sz="2"/>
+              <w:right w:val="none"/>
+            </w:tcBorders>
+            <w:shd w:fill="F7F8FA" w:color="auto" w:val="clear"/>
+            <w:tcMar>
+              <w:top w:type="dxa" w:w="90"/>
+              <w:left w:type="dxa" w:w="110"/>
+              <w:bottom w:type="dxa" w:w="90"/>
+              <w:right w:type="dxa" w:w="110"/>
+            </w:tcMar>
+          </w:tcPr>
+          <w:p>
+            <w:pPr>
+              <w:spacing w:after="0" w:before="0" w:line="276"/>
+            </w:pPr>
+            <w:r>
+              <w:rPr>
+                <w:rFonts w:ascii="Calibri" w:cs="Calibri" w:eastAsia="Calibri" w:hAnsi="Calibri"/>
+                <w:b/>
+                <w:bCs/>
+                <w:color w:val="161A23"/>
+                <w:sz w:val="19"/>
+                <w:szCs w:val="19"/>
+              </w:rPr>
+              <w:t xml:space="preserve">TV show detail</w:t>
+            </w:r>
+          </w:p>
+        </w:tc>
+        <w:tc>
+          <w:tcPr>
+            <w:tcW w:type="dxa" w:w="6160"/>
+            <w:tcBorders>
+              <w:top w:val="single" w:color="DBDFE8" w:sz="2"/>
+              <w:left w:val="none"/>
+              <w:bottom w:val="single" w:color="DBDFE8" w:sz="2"/>
+              <w:right w:val="none"/>
+            </w:tcBorders>
+            <w:shd w:fill="F7F8FA" w:color="auto" w:val="clear"/>
+            <w:tcMar>
+              <w:top w:type="dxa" w:w="90"/>
+              <w:left w:type="dxa" w:w="110"/>
+              <w:bottom w:type="dxa" w:w="90"/>
+              <w:right w:type="dxa" w:w="110"/>
+            </w:tcMar>
+          </w:tcPr>
+          <w:p>
+            <w:pPr>
+              <w:spacing w:after="0" w:before="0" w:line="276"/>
+            </w:pPr>
+            <w:r>
+              <w:rPr>
+                <w:rFonts w:ascii="Consolas" w:cs="Consolas" w:eastAsia="Consolas" w:hAnsi="Consolas"/>
+                <w:color w:val="1B5FD9"/>
+                <w:sz w:val="18"/>
+                <w:szCs w:val="18"/>
+              </w:rPr>
+              <w:t xml:space="preserve">?screen=detail&amp;kind=show&amp;i=0</w:t>
+            </w:r>
+          </w:p>
+        </w:tc>
+      </w:tr>
+      <w:tr>
+        <w:tc>
+          <w:tcPr>
+            <w:tcW w:type="dxa" w:w="3200"/>
+            <w:tcBorders>
+              <w:top w:val="single" w:color="DBDFE8" w:sz="2"/>
+              <w:left w:val="none"/>
+              <w:bottom w:val="single" w:color="DBDFE8" w:sz="2"/>
+              <w:right w:val="none"/>
+            </w:tcBorders>
+            <w:tcMar>
+              <w:top w:type="dxa" w:w="90"/>
+              <w:left w:type="dxa" w:w="110"/>
+              <w:bottom w:type="dxa" w:w="90"/>
+              <w:right w:type="dxa" w:w="110"/>
+            </w:tcMar>
+          </w:tcPr>
+          <w:p>
+            <w:pPr>
+              <w:spacing w:after="0" w:before="0" w:line="276"/>
+            </w:pPr>
+            <w:r>
+              <w:rPr>
+                <w:rFonts w:ascii="Calibri" w:cs="Calibri" w:eastAsia="Calibri" w:hAnsi="Calibri"/>
+                <w:b/>
+                <w:bCs/>
+                <w:color w:val="161A23"/>
+                <w:sz w:val="19"/>
+                <w:szCs w:val="19"/>
+              </w:rPr>
+              <w:t xml:space="preserve">Player</w:t>
+            </w:r>
+          </w:p>
+        </w:tc>
+        <w:tc>
+          <w:tcPr>
+            <w:tcW w:type="dxa" w:w="6160"/>
+            <w:tcBorders>
+              <w:top w:val="single" w:color="DBDFE8" w:sz="2"/>
+              <w:left w:val="none"/>
+              <w:bottom w:val="single" w:color="DBDFE8" w:sz="2"/>
+              <w:right w:val="none"/>
+            </w:tcBorders>
+            <w:tcMar>
+              <w:top w:type="dxa" w:w="90"/>
+              <w:left w:type="dxa" w:w="110"/>
+              <w:bottom w:type="dxa" w:w="90"/>
+              <w:right w:type="dxa" w:w="110"/>
+            </w:tcMar>
+          </w:tcPr>
+          <w:p>
+            <w:pPr>
+              <w:spacing w:after="0" w:before="0" w:line="276"/>
+            </w:pPr>
+            <w:r>
+              <w:rPr>
+                <w:rFonts w:ascii="Consolas" w:cs="Consolas" w:eastAsia="Consolas" w:hAnsi="Consolas"/>
+                <w:color w:val="1B5FD9"/>
+                <w:sz w:val="18"/>
+                <w:szCs w:val="18"/>
+              </w:rPr>
+              <w:t xml:space="preserve">?screen=player</w:t>
+            </w:r>
+          </w:p>
+        </w:tc>
+      </w:tr>
+      <w:tr>
+        <w:tc>
+          <w:tcPr>
+            <w:tcW w:type="dxa" w:w="3200"/>
+            <w:tcBorders>
+              <w:top w:val="single" w:color="DBDFE8" w:sz="2"/>
+              <w:left w:val="none"/>
+              <w:bottom w:val="single" w:color="DBDFE8" w:sz="2"/>
+              <w:right w:val="none"/>
+            </w:tcBorders>
+            <w:shd w:fill="F7F8FA" w:color="auto" w:val="clear"/>
+            <w:tcMar>
+              <w:top w:type="dxa" w:w="90"/>
+              <w:left w:type="dxa" w:w="110"/>
+              <w:bottom w:type="dxa" w:w="90"/>
+              <w:right w:type="dxa" w:w="110"/>
+            </w:tcMar>
+          </w:tcPr>
+          <w:p>
+            <w:pPr>
+              <w:spacing w:after="0" w:before="0" w:line="276"/>
+            </w:pPr>
+            <w:r>
+              <w:rPr>
+                <w:rFonts w:ascii="Calibri" w:cs="Calibri" w:eastAsia="Calibri" w:hAnsi="Calibri"/>
+                <w:b/>
+                <w:bCs/>
+                <w:color w:val="161A23"/>
+                <w:sz w:val="19"/>
+                <w:szCs w:val="19"/>
+              </w:rPr>
+              <w:t xml:space="preserve">Live TV — guide open</w:t>
+            </w:r>
+          </w:p>
+        </w:tc>
+        <w:tc>
+          <w:tcPr>
+            <w:tcW w:type="dxa" w:w="6160"/>
+            <w:tcBorders>
+              <w:top w:val="single" w:color="DBDFE8" w:sz="2"/>
+              <w:left w:val="none"/>
+              <w:bottom w:val="single" w:color="DBDFE8" w:sz="2"/>
+              <w:right w:val="none"/>
+            </w:tcBorders>
+            <w:shd w:fill="F7F8FA" w:color="auto" w:val="clear"/>
+            <w:tcMar>
+              <w:top w:type="dxa" w:w="90"/>
+              <w:left w:type="dxa" w:w="110"/>
+              <w:bottom w:type="dxa" w:w="90"/>
+              <w:right w:type="dxa" w:w="110"/>
+            </w:tcMar>
+          </w:tcPr>
+          <w:p>
+            <w:pPr>
+              <w:spacing w:after="0" w:before="0" w:line="276"/>
+            </w:pPr>
+            <w:r>
+              <w:rPr>
+                <w:rFonts w:ascii="Consolas" w:cs="Consolas" w:eastAsia="Consolas" w:hAnsi="Consolas"/>
+                <w:color w:val="1B5FD9"/>
+                <w:sz w:val="18"/>
+                <w:szCs w:val="18"/>
+              </w:rPr>
+              <w:t xml:space="preserve">?screen=livetv&amp;ch=0</w:t>
+            </w:r>
+          </w:p>
+        </w:tc>
+      </w:tr>
+      <w:tr>
+        <w:tc>
+          <w:tcPr>
+            <w:tcW w:type="dxa" w:w="3200"/>
+            <w:tcBorders>
+              <w:top w:val="single" w:color="DBDFE8" w:sz="2"/>
+              <w:left w:val="none"/>
+              <w:bottom w:val="single" w:color="DBDFE8" w:sz="2"/>
+              <w:right w:val="none"/>
+            </w:tcBorders>
+            <w:tcMar>
+              <w:top w:type="dxa" w:w="90"/>
+              <w:left w:type="dxa" w:w="110"/>
+              <w:bottom w:type="dxa" w:w="90"/>
+              <w:right w:type="dxa" w:w="110"/>
+            </w:tcMar>
+          </w:tcPr>
+          <w:p>
+            <w:pPr>
+              <w:spacing w:after="0" w:before="0" w:line="276"/>
+            </w:pPr>
+            <w:r>
+              <w:rPr>
+                <w:rFonts w:ascii="Calibri" w:cs="Calibri" w:eastAsia="Calibri" w:hAnsi="Calibri"/>
+                <w:b/>
+                <w:bCs/>
+                <w:color w:val="161A23"/>
+                <w:sz w:val="19"/>
+                <w:szCs w:val="19"/>
+              </w:rPr>
+              <w:t xml:space="preserve">Live TV — guide closed</w:t>
+            </w:r>
+          </w:p>
+        </w:tc>
+        <w:tc>
+          <w:tcPr>
+            <w:tcW w:type="dxa" w:w="6160"/>
+            <w:tcBorders>
+              <w:top w:val="single" w:color="DBDFE8" w:sz="2"/>
+              <w:left w:val="none"/>
+              <w:bottom w:val="single" w:color="DBDFE8" w:sz="2"/>
+              <w:right w:val="none"/>
+            </w:tcBorders>
+            <w:tcMar>
+              <w:top w:type="dxa" w:w="90"/>
+              <w:left w:type="dxa" w:w="110"/>
+              <w:bottom w:type="dxa" w:w="90"/>
+              <w:right w:type="dxa" w:w="110"/>
+            </w:tcMar>
+          </w:tcPr>
+          <w:p>
+            <w:pPr>
+              <w:spacing w:after="0" w:before="0" w:line="276"/>
+            </w:pPr>
+            <w:r>
+              <w:rPr>
+                <w:rFonts w:ascii="Consolas" w:cs="Consolas" w:eastAsia="Consolas" w:hAnsi="Consolas"/>
+                <w:color w:val="1B5FD9"/>
+                <w:sz w:val="18"/>
+                <w:szCs w:val="18"/>
+              </w:rPr>
+              <w:t xml:space="preserve">?screen=livetv&amp;ch=0&amp;guide=0</w:t>
+            </w:r>
+          </w:p>
+        </w:tc>
+      </w:tr>
+      <w:tr>
+        <w:tc>
+          <w:tcPr>
+            <w:tcW w:type="dxa" w:w="3200"/>
+            <w:tcBorders>
+              <w:top w:val="single" w:color="DBDFE8" w:sz="2"/>
+              <w:left w:val="none"/>
+              <w:bottom w:val="single" w:color="DBDFE8" w:sz="2"/>
+              <w:right w:val="none"/>
+            </w:tcBorders>
+            <w:shd w:fill="F7F8FA" w:color="auto" w:val="clear"/>
+            <w:tcMar>
+              <w:top w:type="dxa" w:w="90"/>
+              <w:left w:type="dxa" w:w="110"/>
+              <w:bottom w:type="dxa" w:w="90"/>
+              <w:right w:type="dxa" w:w="110"/>
+            </w:tcMar>
+          </w:tcPr>
+          <w:p>
+            <w:pPr>
+              <w:spacing w:after="0" w:before="0" w:line="276"/>
+            </w:pPr>
+            <w:r>
+              <w:rPr>
+                <w:rFonts w:ascii="Calibri" w:cs="Calibri" w:eastAsia="Calibri" w:hAnsi="Calibri"/>
+                <w:b/>
+                <w:bCs/>
+                <w:color w:val="161A23"/>
+                <w:sz w:val="19"/>
+                <w:szCs w:val="19"/>
+              </w:rPr>
+              <w:t xml:space="preserve">Live TV — all channels</w:t>
+            </w:r>
+          </w:p>
+        </w:tc>
+        <w:tc>
+          <w:tcPr>
+            <w:tcW w:type="dxa" w:w="6160"/>
+            <w:tcBorders>
+              <w:top w:val="single" w:color="DBDFE8" w:sz="2"/>
+              <w:left w:val="none"/>
+              <w:bottom w:val="single" w:color="DBDFE8" w:sz="2"/>
+              <w:right w:val="none"/>
+            </w:tcBorders>
+            <w:shd w:fill="F7F8FA" w:color="auto" w:val="clear"/>
+            <w:tcMar>
+              <w:top w:type="dxa" w:w="90"/>
+              <w:left w:type="dxa" w:w="110"/>
+              <w:bottom w:type="dxa" w:w="90"/>
+              <w:right w:type="dxa" w:w="110"/>
+            </w:tcMar>
+          </w:tcPr>
+          <w:p>
+            <w:pPr>
+              <w:spacing w:after="0" w:before="0" w:line="276"/>
+            </w:pPr>
+            <w:r>
+              <w:rPr>
+                <w:rFonts w:ascii="Consolas" w:cs="Consolas" w:eastAsia="Consolas" w:hAnsi="Consolas"/>
+                <w:color w:val="1B5FD9"/>
+                <w:sz w:val="18"/>
+                <w:szCs w:val="18"/>
+              </w:rPr>
+              <w:t xml:space="preserve">?screen=livetv&amp;ch=0&amp;all=1</w:t>
+            </w:r>
+          </w:p>
+        </w:tc>
+      </w:tr>
+      <w:tr>
+        <w:tc>
+          <w:tcPr>
+            <w:tcW w:type="dxa" w:w="3200"/>
+            <w:tcBorders>
+              <w:top w:val="single" w:color="DBDFE8" w:sz="2"/>
+              <w:left w:val="none"/>
+              <w:bottom w:val="single" w:color="DBDFE8" w:sz="2"/>
+              <w:right w:val="none"/>
+            </w:tcBorders>
+            <w:tcMar>
+              <w:top w:type="dxa" w:w="90"/>
+              <w:left w:type="dxa" w:w="110"/>
+              <w:bottom w:type="dxa" w:w="90"/>
+              <w:right w:type="dxa" w:w="110"/>
+            </w:tcMar>
+          </w:tcPr>
+          <w:p>
+            <w:pPr>
+              <w:spacing w:after="0" w:before="0" w:line="276"/>
+            </w:pPr>
+            <w:r>
+              <w:rPr>
+                <w:rFonts w:ascii="Calibri" w:cs="Calibri" w:eastAsia="Calibri" w:hAnsi="Calibri"/>
+                <w:b/>
+                <w:bCs/>
+                <w:color w:val="161A23"/>
+                <w:sz w:val="19"/>
+                <w:szCs w:val="19"/>
+              </w:rPr>
+              <w:t xml:space="preserve">Search — resting</w:t>
+            </w:r>
+          </w:p>
+        </w:tc>
+        <w:tc>
+          <w:tcPr>
+            <w:tcW w:type="dxa" w:w="6160"/>
+            <w:tcBorders>
+              <w:top w:val="single" w:color="DBDFE8" w:sz="2"/>
+              <w:left w:val="none"/>
+              <w:bottom w:val="single" w:color="DBDFE8" w:sz="2"/>
+              <w:right w:val="none"/>
+            </w:tcBorders>
+            <w:tcMar>
+              <w:top w:type="dxa" w:w="90"/>
+              <w:left w:type="dxa" w:w="110"/>
+              <w:bottom w:type="dxa" w:w="90"/>
+              <w:right w:type="dxa" w:w="110"/>
+            </w:tcMar>
+          </w:tcPr>
+          <w:p>
+            <w:pPr>
+              <w:spacing w:after="0" w:before="0" w:line="276"/>
+            </w:pPr>
+            <w:r>
+              <w:rPr>
+                <w:rFonts w:ascii="Consolas" w:cs="Consolas" w:eastAsia="Consolas" w:hAnsi="Consolas"/>
+                <w:color w:val="1B5FD9"/>
+                <w:sz w:val="18"/>
+                <w:szCs w:val="18"/>
+              </w:rPr>
+              <w:t xml:space="preserve">?screen=search</w:t>
+            </w:r>
+          </w:p>
+        </w:tc>
+      </w:tr>
+      <w:tr>
+        <w:tc>
+          <w:tcPr>
+            <w:tcW w:type="dxa" w:w="3200"/>
+            <w:tcBorders>
+              <w:top w:val="single" w:color="DBDFE8" w:sz="2"/>
+              <w:left w:val="none"/>
+              <w:bottom w:val="single" w:color="DBDFE8" w:sz="2"/>
+              <w:right w:val="none"/>
+            </w:tcBorders>
+            <w:shd w:fill="F7F8FA" w:color="auto" w:val="clear"/>
+            <w:tcMar>
+              <w:top w:type="dxa" w:w="90"/>
+              <w:left w:type="dxa" w:w="110"/>
+              <w:bottom w:type="dxa" w:w="90"/>
+              <w:right w:type="dxa" w:w="110"/>
+            </w:tcMar>
+          </w:tcPr>
+          <w:p>
+            <w:pPr>
+              <w:spacing w:after="0" w:before="0" w:line="276"/>
+            </w:pPr>
+            <w:r>
+              <w:rPr>
+                <w:rFonts w:ascii="Calibri" w:cs="Calibri" w:eastAsia="Calibri" w:hAnsi="Calibri"/>
+                <w:b/>
+                <w:bCs/>
+                <w:color w:val="161A23"/>
+                <w:sz w:val="19"/>
+                <w:szCs w:val="19"/>
+              </w:rPr>
+              <w:t xml:space="preserve">Search — results</w:t>
+            </w:r>
+          </w:p>
+        </w:tc>
+        <w:tc>
+          <w:tcPr>
+            <w:tcW w:type="dxa" w:w="6160"/>
+            <w:tcBorders>
+              <w:top w:val="single" w:color="DBDFE8" w:sz="2"/>
+              <w:left w:val="none"/>
+              <w:bottom w:val="single" w:color="DBDFE8" w:sz="2"/>
+              <w:right w:val="none"/>
+            </w:tcBorders>
+            <w:shd w:fill="F7F8FA" w:color="auto" w:val="clear"/>
+            <w:tcMar>
+              <w:top w:type="dxa" w:w="90"/>
+              <w:left w:type="dxa" w:w="110"/>
+              <w:bottom w:type="dxa" w:w="90"/>
+              <w:right w:type="dxa" w:w="110"/>
+            </w:tcMar>
+          </w:tcPr>
+          <w:p>
+            <w:pPr>
+              <w:spacing w:after="0" w:before="0" w:line="276"/>
+            </w:pPr>
+            <w:r>
+              <w:rPr>
+                <w:rFonts w:ascii="Consolas" w:cs="Consolas" w:eastAsia="Consolas" w:hAnsi="Consolas"/>
+                <w:color w:val="1B5FD9"/>
+                <w:sz w:val="18"/>
+                <w:szCs w:val="18"/>
+              </w:rPr>
+              <w:t xml:space="preserve">?screen=search&amp;q=spider</w:t>
+            </w:r>
+          </w:p>
+        </w:tc>
+      </w:tr>
+      <w:tr>
+        <w:tc>
+          <w:tcPr>
+            <w:tcW w:type="dxa" w:w="3200"/>
+            <w:tcBorders>
+              <w:top w:val="single" w:color="DBDFE8" w:sz="2"/>
+              <w:left w:val="none"/>
+              <w:bottom w:val="single" w:color="DBDFE8" w:sz="2"/>
+              <w:right w:val="none"/>
+            </w:tcBorders>
+            <w:tcMar>
+              <w:top w:type="dxa" w:w="90"/>
+              <w:left w:type="dxa" w:w="110"/>
+              <w:bottom w:type="dxa" w:w="90"/>
+              <w:right w:type="dxa" w:w="110"/>
+            </w:tcMar>
+          </w:tcPr>
+          <w:p>
+            <w:pPr>
+              <w:spacing w:after="0" w:before="0" w:line="276"/>
+            </w:pPr>
+            <w:r>
+              <w:rPr>
+                <w:rFonts w:ascii="Calibri" w:cs="Calibri" w:eastAsia="Calibri" w:hAnsi="Calibri"/>
+                <w:b/>
+                <w:bCs/>
+                <w:color w:val="161A23"/>
+                <w:sz w:val="19"/>
+                <w:szCs w:val="19"/>
+              </w:rPr>
+              <w:t xml:space="preserve">Search — no results</w:t>
+            </w:r>
+          </w:p>
+        </w:tc>
+        <w:tc>
+          <w:tcPr>
+            <w:tcW w:type="dxa" w:w="6160"/>
+            <w:tcBorders>
+              <w:top w:val="single" w:color="DBDFE8" w:sz="2"/>
+              <w:left w:val="none"/>
+              <w:bottom w:val="single" w:color="DBDFE8" w:sz="2"/>
+              <w:right w:val="none"/>
+            </w:tcBorders>
+            <w:tcMar>
+              <w:top w:type="dxa" w:w="90"/>
+              <w:left w:type="dxa" w:w="110"/>
+              <w:bottom w:type="dxa" w:w="90"/>
+              <w:right w:type="dxa" w:w="110"/>
+            </w:tcMar>
+          </w:tcPr>
+          <w:p>
+            <w:pPr>
+              <w:spacing w:after="0" w:before="0" w:line="276"/>
+            </w:pPr>
+            <w:r>
+              <w:rPr>
+                <w:rFonts w:ascii="Consolas" w:cs="Consolas" w:eastAsia="Consolas" w:hAnsi="Consolas"/>
+                <w:color w:val="1B5FD9"/>
+                <w:sz w:val="18"/>
+                <w:szCs w:val="18"/>
+              </w:rPr>
+              <w:t xml:space="preserve">?screen=search&amp;q=zzzz</w:t>
+            </w:r>
+          </w:p>
+        </w:tc>
+      </w:tr>
+      <w:tr>
+        <w:tc>
+          <w:tcPr>
+            <w:tcW w:type="dxa" w:w="3200"/>
+            <w:tcBorders>
+              <w:top w:val="single" w:color="DBDFE8" w:sz="2"/>
+              <w:left w:val="none"/>
+              <w:bottom w:val="single" w:color="DBDFE8" w:sz="2"/>
+              <w:right w:val="none"/>
+            </w:tcBorders>
+            <w:shd w:fill="F7F8FA" w:color="auto" w:val="clear"/>
+            <w:tcMar>
+              <w:top w:type="dxa" w:w="90"/>
+              <w:left w:type="dxa" w:w="110"/>
+              <w:bottom w:type="dxa" w:w="90"/>
+              <w:right w:type="dxa" w:w="110"/>
+            </w:tcMar>
+          </w:tcPr>
+          <w:p>
+            <w:pPr>
+              <w:spacing w:after="0" w:before="0" w:line="276"/>
+            </w:pPr>
+            <w:r>
+              <w:rPr>
+                <w:rFonts w:ascii="Calibri" w:cs="Calibri" w:eastAsia="Calibri" w:hAnsi="Calibri"/>
+                <w:b/>
+                <w:bCs/>
+                <w:color w:val="161A23"/>
+                <w:sz w:val="19"/>
+                <w:szCs w:val="19"/>
+              </w:rPr>
+              <w:t xml:space="preserve">Browse — portrait grid</w:t>
+            </w:r>
+          </w:p>
+        </w:tc>
+        <w:tc>
+          <w:tcPr>
+            <w:tcW w:type="dxa" w:w="6160"/>
+            <w:tcBorders>
+              <w:top w:val="single" w:color="DBDFE8" w:sz="2"/>
+              <w:left w:val="none"/>
+              <w:bottom w:val="single" w:color="DBDFE8" w:sz="2"/>
+              <w:right w:val="none"/>
+            </w:tcBorders>
+            <w:shd w:fill="F7F8FA" w:color="auto" w:val="clear"/>
+            <w:tcMar>
+              <w:top w:type="dxa" w:w="90"/>
+              <w:left w:type="dxa" w:w="110"/>
+              <w:bottom w:type="dxa" w:w="90"/>
+              <w:right w:type="dxa" w:w="110"/>
+            </w:tcMar>
+          </w:tcPr>
+          <w:p>
+            <w:pPr>
+              <w:spacing w:after="0" w:before="0" w:line="276"/>
+            </w:pPr>
+            <w:r>
+              <w:rPr>
+                <w:rFonts w:ascii="Consolas" w:cs="Consolas" w:eastAsia="Consolas" w:hAnsi="Consolas"/>
+                <w:color w:val="1B5FD9"/>
+                <w:sz w:val="18"/>
+                <w:szCs w:val="18"/>
+              </w:rPr>
+              <w:t xml:space="preserve">?screen=browse&amp;row=moviesRow</w:t>
+            </w:r>
+          </w:p>
+        </w:tc>
+      </w:tr>
+      <w:tr>
+        <w:tc>
+          <w:tcPr>
+            <w:tcW w:type="dxa" w:w="3200"/>
+            <w:tcBorders>
+              <w:top w:val="single" w:color="DBDFE8" w:sz="2"/>
+              <w:left w:val="none"/>
+              <w:bottom w:val="single" w:color="DBDFE8" w:sz="2"/>
+              <w:right w:val="none"/>
+            </w:tcBorders>
+            <w:tcMar>
+              <w:top w:type="dxa" w:w="90"/>
+              <w:left w:type="dxa" w:w="110"/>
+              <w:bottom w:type="dxa" w:w="90"/>
+              <w:right w:type="dxa" w:w="110"/>
+            </w:tcMar>
+          </w:tcPr>
+          <w:p>
+            <w:pPr>
+              <w:spacing w:after="0" w:before="0" w:line="276"/>
+            </w:pPr>
+            <w:r>
+              <w:rPr>
+                <w:rFonts w:ascii="Calibri" w:cs="Calibri" w:eastAsia="Calibri" w:hAnsi="Calibri"/>
+                <w:b/>
+                <w:bCs/>
+                <w:color w:val="161A23"/>
+                <w:sz w:val="19"/>
+                <w:szCs w:val="19"/>
+              </w:rPr>
+              <w:t xml:space="preserve">Browse — channel grid</w:t>
+            </w:r>
+          </w:p>
+        </w:tc>
+        <w:tc>
+          <w:tcPr>
+            <w:tcW w:type="dxa" w:w="6160"/>
+            <w:tcBorders>
+              <w:top w:val="single" w:color="DBDFE8" w:sz="2"/>
+              <w:left w:val="none"/>
+              <w:bottom w:val="single" w:color="DBDFE8" w:sz="2"/>
+              <w:right w:val="none"/>
+            </w:tcBorders>
+            <w:tcMar>
+              <w:top w:type="dxa" w:w="90"/>
+              <w:left w:type="dxa" w:w="110"/>
+              <w:bottom w:type="dxa" w:w="90"/>
+              <w:right w:type="dxa" w:w="110"/>
+            </w:tcMar>
+          </w:tcPr>
+          <w:p>
+            <w:pPr>
+              <w:spacing w:after="0" w:before="0" w:line="276"/>
+            </w:pPr>
+            <w:r>
+              <w:rPr>
+                <w:rFonts w:ascii="Consolas" w:cs="Consolas" w:eastAsia="Consolas" w:hAnsi="Consolas"/>
+                <w:color w:val="1B5FD9"/>
+                <w:sz w:val="18"/>
+                <w:szCs w:val="18"/>
+              </w:rPr>
+              <w:t xml:space="preserve">?screen=browse&amp;row=liveTVRow</w:t>
+            </w:r>
+          </w:p>
+        </w:tc>
+      </w:tr>
+      <w:tr>
+        <w:tc>
+          <w:tcPr>
+            <w:tcW w:type="dxa" w:w="3200"/>
+            <w:tcBorders>
+              <w:top w:val="single" w:color="DBDFE8" w:sz="2"/>
+              <w:left w:val="none"/>
+              <w:bottom w:val="single" w:color="DBDFE8" w:sz="2"/>
+              <w:right w:val="none"/>
+            </w:tcBorders>
+            <w:shd w:fill="F7F8FA" w:color="auto" w:val="clear"/>
+            <w:tcMar>
+              <w:top w:type="dxa" w:w="90"/>
+              <w:left w:type="dxa" w:w="110"/>
+              <w:bottom w:type="dxa" w:w="90"/>
+              <w:right w:type="dxa" w:w="110"/>
+            </w:tcMar>
+          </w:tcPr>
+          <w:p>
+            <w:pPr>
+              <w:spacing w:after="0" w:before="0" w:line="276"/>
+            </w:pPr>
+            <w:r>
+              <w:rPr>
+                <w:rFonts w:ascii="Calibri" w:cs="Calibri" w:eastAsia="Calibri" w:hAnsi="Calibri"/>
+                <w:b/>
+                <w:bCs/>
+                <w:color w:val="161A23"/>
+                <w:sz w:val="19"/>
+                <w:szCs w:val="19"/>
+              </w:rPr>
+              <w:t xml:space="preserve">Browse — voucher grid</w:t>
+            </w:r>
+          </w:p>
+        </w:tc>
+        <w:tc>
+          <w:tcPr>
+            <w:tcW w:type="dxa" w:w="6160"/>
+            <w:tcBorders>
+              <w:top w:val="single" w:color="DBDFE8" w:sz="2"/>
+              <w:left w:val="none"/>
+              <w:bottom w:val="single" w:color="DBDFE8" w:sz="2"/>
+              <w:right w:val="none"/>
+            </w:tcBorders>
+            <w:shd w:fill="F7F8FA" w:color="auto" w:val="clear"/>
+            <w:tcMar>
+              <w:top w:type="dxa" w:w="90"/>
+              <w:left w:type="dxa" w:w="110"/>
+              <w:bottom w:type="dxa" w:w="90"/>
+              <w:right w:type="dxa" w:w="110"/>
+            </w:tcMar>
+          </w:tcPr>
+          <w:p>
+            <w:pPr>
+              <w:spacing w:after="0" w:before="0" w:line="276"/>
+            </w:pPr>
+            <w:r>
+              <w:rPr>
+                <w:rFonts w:ascii="Consolas" w:cs="Consolas" w:eastAsia="Consolas" w:hAnsi="Consolas"/>
+                <w:color w:val="1B5FD9"/>
+                <w:sz w:val="18"/>
+                <w:szCs w:val="18"/>
+              </w:rPr>
+              <w:t xml:space="preserve">?screen=browse&amp;row=shopRow</w:t>
+            </w:r>
+          </w:p>
+        </w:tc>
+      </w:tr>
+      <w:tr>
+        <w:tc>
+          <w:tcPr>
+            <w:tcW w:type="dxa" w:w="3200"/>
+            <w:tcBorders>
+              <w:top w:val="single" w:color="DBDFE8" w:sz="2"/>
+              <w:left w:val="none"/>
+              <w:bottom w:val="single" w:color="DBDFE8" w:sz="2"/>
+              <w:right w:val="none"/>
+            </w:tcBorders>
+            <w:tcMar>
+              <w:top w:type="dxa" w:w="90"/>
+              <w:left w:type="dxa" w:w="110"/>
+              <w:bottom w:type="dxa" w:w="90"/>
+              <w:right w:type="dxa" w:w="110"/>
+            </w:tcMar>
+          </w:tcPr>
+          <w:p>
+            <w:pPr>
+              <w:spacing w:after="0" w:before="0" w:line="276"/>
+            </w:pPr>
+            <w:r>
+              <w:rPr>
+                <w:rFonts w:ascii="Calibri" w:cs="Calibri" w:eastAsia="Calibri" w:hAnsi="Calibri"/>
+                <w:b/>
+                <w:bCs/>
+                <w:color w:val="161A23"/>
+                <w:sz w:val="19"/>
+                <w:szCs w:val="19"/>
+              </w:rPr>
+              <w:t xml:space="preserve">Account — overview, free</w:t>
+            </w:r>
+          </w:p>
+        </w:tc>
+        <w:tc>
+          <w:tcPr>
+            <w:tcW w:type="dxa" w:w="6160"/>
+            <w:tcBorders>
+              <w:top w:val="single" w:color="DBDFE8" w:sz="2"/>
+              <w:left w:val="none"/>
+              <w:bottom w:val="single" w:color="DBDFE8" w:sz="2"/>
+              <w:right w:val="none"/>
+            </w:tcBorders>
+            <w:tcMar>
+              <w:top w:type="dxa" w:w="90"/>
+              <w:left w:type="dxa" w:w="110"/>
+              <w:bottom w:type="dxa" w:w="90"/>
+              <w:right w:type="dxa" w:w="110"/>
+            </w:tcMar>
+          </w:tcPr>
+          <w:p>
+            <w:pPr>
+              <w:spacing w:after="0" w:before="0" w:line="276"/>
+            </w:pPr>
+            <w:r>
+              <w:rPr>
+                <w:rFonts w:ascii="Consolas" w:cs="Consolas" w:eastAsia="Consolas" w:hAnsi="Consolas"/>
+                <w:color w:val="1B5FD9"/>
+                <w:sz w:val="18"/>
+                <w:szCs w:val="18"/>
+              </w:rPr>
+              <w:t xml:space="preserve">?screen=account&amp;tier=avod</w:t>
+            </w:r>
+          </w:p>
+        </w:tc>
+      </w:tr>
+      <w:tr>
+        <w:tc>
+          <w:tcPr>
+            <w:tcW w:type="dxa" w:w="3200"/>
+            <w:tcBorders>
+              <w:top w:val="single" w:color="DBDFE8" w:sz="2"/>
+              <w:left w:val="none"/>
+              <w:bottom w:val="single" w:color="DBDFE8" w:sz="2"/>
+              <w:right w:val="none"/>
+            </w:tcBorders>
+            <w:shd w:fill="F7F8FA" w:color="auto" w:val="clear"/>
+            <w:tcMar>
+              <w:top w:type="dxa" w:w="90"/>
+              <w:left w:type="dxa" w:w="110"/>
+              <w:bottom w:type="dxa" w:w="90"/>
+              <w:right w:type="dxa" w:w="110"/>
+            </w:tcMar>
+          </w:tcPr>
+          <w:p>
+            <w:pPr>
+              <w:spacing w:after="0" w:before="0" w:line="276"/>
+            </w:pPr>
+            <w:r>
+              <w:rPr>
+                <w:rFonts w:ascii="Calibri" w:cs="Calibri" w:eastAsia="Calibri" w:hAnsi="Calibri"/>
+                <w:b/>
+                <w:bCs/>
+                <w:color w:val="161A23"/>
+                <w:sz w:val="19"/>
+                <w:szCs w:val="19"/>
+              </w:rPr>
+              <w:t xml:space="preserve">Account — overview, PRO</w:t>
+            </w:r>
+          </w:p>
+        </w:tc>
+        <w:tc>
+          <w:tcPr>
+            <w:tcW w:type="dxa" w:w="6160"/>
+            <w:tcBorders>
+              <w:top w:val="single" w:color="DBDFE8" w:sz="2"/>
+              <w:left w:val="none"/>
+              <w:bottom w:val="single" w:color="DBDFE8" w:sz="2"/>
+              <w:right w:val="none"/>
+            </w:tcBorders>
+            <w:shd w:fill="F7F8FA" w:color="auto" w:val="clear"/>
+            <w:tcMar>
+              <w:top w:type="dxa" w:w="90"/>
+              <w:left w:type="dxa" w:w="110"/>
+              <w:bottom w:type="dxa" w:w="90"/>
+              <w:right w:type="dxa" w:w="110"/>
+            </w:tcMar>
+          </w:tcPr>
+          <w:p>
+            <w:pPr>
+              <w:spacing w:after="0" w:before="0" w:line="276"/>
+            </w:pPr>
+            <w:r>
+              <w:rPr>
+                <w:rFonts w:ascii="Consolas" w:cs="Consolas" w:eastAsia="Consolas" w:hAnsi="Consolas"/>
+                <w:color w:val="1B5FD9"/>
+                <w:sz w:val="18"/>
+                <w:szCs w:val="18"/>
+              </w:rPr>
+              <w:t xml:space="preserve">?screen=account&amp;tier=pro</w:t>
+            </w:r>
+          </w:p>
+        </w:tc>
+      </w:tr>
+      <w:tr>
+        <w:tc>
+          <w:tcPr>
+            <w:tcW w:type="dxa" w:w="3200"/>
+            <w:tcBorders>
+              <w:top w:val="single" w:color="DBDFE8" w:sz="2"/>
+              <w:left w:val="none"/>
+              <w:bottom w:val="single" w:color="DBDFE8" w:sz="2"/>
+              <w:right w:val="none"/>
+            </w:tcBorders>
+            <w:tcMar>
+              <w:top w:type="dxa" w:w="90"/>
+              <w:left w:type="dxa" w:w="110"/>
+              <w:bottom w:type="dxa" w:w="90"/>
+              <w:right w:type="dxa" w:w="110"/>
+            </w:tcMar>
+          </w:tcPr>
+          <w:p>
+            <w:pPr>
+              <w:spacing w:after="0" w:before="0" w:line="276"/>
+            </w:pPr>
+            <w:r>
+              <w:rPr>
+                <w:rFonts w:ascii="Calibri" w:cs="Calibri" w:eastAsia="Calibri" w:hAnsi="Calibri"/>
+                <w:b/>
+                <w:bCs/>
+                <w:color w:val="161A23"/>
+                <w:sz w:val="19"/>
+                <w:szCs w:val="19"/>
+              </w:rPr>
+              <w:t xml:space="preserve">Account — membership</w:t>
+            </w:r>
+          </w:p>
+        </w:tc>
+        <w:tc>
+          <w:tcPr>
+            <w:tcW w:type="dxa" w:w="6160"/>
+            <w:tcBorders>
+              <w:top w:val="single" w:color="DBDFE8" w:sz="2"/>
+              <w:left w:val="none"/>
+              <w:bottom w:val="single" w:color="DBDFE8" w:sz="2"/>
+              <w:right w:val="none"/>
+            </w:tcBorders>
+            <w:tcMar>
+              <w:top w:type="dxa" w:w="90"/>
+              <w:left w:type="dxa" w:w="110"/>
+              <w:bottom w:type="dxa" w:w="90"/>
+              <w:right w:type="dxa" w:w="110"/>
+            </w:tcMar>
+          </w:tcPr>
+          <w:p>
+            <w:pPr>
+              <w:spacing w:after="0" w:before="0" w:line="276"/>
+            </w:pPr>
+            <w:r>
+              <w:rPr>
+                <w:rFonts w:ascii="Consolas" w:cs="Consolas" w:eastAsia="Consolas" w:hAnsi="Consolas"/>
+                <w:color w:val="1B5FD9"/>
+                <w:sz w:val="18"/>
+                <w:szCs w:val="18"/>
+              </w:rPr>
+              <w:t xml:space="preserve">?screen=account&amp;section=membership&amp;tier=pro</w:t>
+            </w:r>
+          </w:p>
+        </w:tc>
+      </w:tr>
+      <w:tr>
+        <w:tc>
+          <w:tcPr>
+            <w:tcW w:type="dxa" w:w="3200"/>
+            <w:tcBorders>
+              <w:top w:val="single" w:color="DBDFE8" w:sz="2"/>
+              <w:left w:val="none"/>
+              <w:bottom w:val="single" w:color="DBDFE8" w:sz="2"/>
+              <w:right w:val="none"/>
+            </w:tcBorders>
+            <w:shd w:fill="F7F8FA" w:color="auto" w:val="clear"/>
+            <w:tcMar>
+              <w:top w:type="dxa" w:w="90"/>
+              <w:left w:type="dxa" w:w="110"/>
+              <w:bottom w:type="dxa" w:w="90"/>
+              <w:right w:type="dxa" w:w="110"/>
+            </w:tcMar>
+          </w:tcPr>
+          <w:p>
+            <w:pPr>
+              <w:spacing w:after="0" w:before="0" w:line="276"/>
+            </w:pPr>
+            <w:r>
+              <w:rPr>
+                <w:rFonts w:ascii="Calibri" w:cs="Calibri" w:eastAsia="Calibri" w:hAnsi="Calibri"/>
+                <w:b/>
+                <w:bCs/>
+                <w:color w:val="161A23"/>
+                <w:sz w:val="19"/>
+                <w:szCs w:val="19"/>
+              </w:rPr>
+              <w:t xml:space="preserve">Account — payment method</w:t>
+            </w:r>
+          </w:p>
+        </w:tc>
+        <w:tc>
+          <w:tcPr>
+            <w:tcW w:type="dxa" w:w="6160"/>
+            <w:tcBorders>
+              <w:top w:val="single" w:color="DBDFE8" w:sz="2"/>
+              <w:left w:val="none"/>
+              <w:bottom w:val="single" w:color="DBDFE8" w:sz="2"/>
+              <w:right w:val="none"/>
+            </w:tcBorders>
+            <w:shd w:fill="F7F8FA" w:color="auto" w:val="clear"/>
+            <w:tcMar>
+              <w:top w:type="dxa" w:w="90"/>
+              <w:left w:type="dxa" w:w="110"/>
+              <w:bottom w:type="dxa" w:w="90"/>
+              <w:right w:type="dxa" w:w="110"/>
+            </w:tcMar>
+          </w:tcPr>
+          <w:p>
+            <w:pPr>
+              <w:spacing w:after="0" w:before="0" w:line="276"/>
+            </w:pPr>
+            <w:r>
+              <w:rPr>
+                <w:rFonts w:ascii="Consolas" w:cs="Consolas" w:eastAsia="Consolas" w:hAnsi="Consolas"/>
+                <w:color w:val="1B5FD9"/>
+                <w:sz w:val="18"/>
+                <w:szCs w:val="18"/>
+              </w:rPr>
+              <w:t xml:space="preserve">?screen=account&amp;section=payment&amp;tier=pro</w:t>
+            </w:r>
+          </w:p>
+        </w:tc>
+      </w:tr>
+      <w:tr>
+        <w:tc>
+          <w:tcPr>
+            <w:tcW w:type="dxa" w:w="3200"/>
+            <w:tcBorders>
+              <w:top w:val="single" w:color="DBDFE8" w:sz="2"/>
+              <w:left w:val="none"/>
+              <w:bottom w:val="single" w:color="DBDFE8" w:sz="2"/>
+              <w:right w:val="none"/>
+            </w:tcBorders>
+            <w:tcMar>
+              <w:top w:type="dxa" w:w="90"/>
+              <w:left w:type="dxa" w:w="110"/>
+              <w:bottom w:type="dxa" w:w="90"/>
+              <w:right w:type="dxa" w:w="110"/>
+            </w:tcMar>
+          </w:tcPr>
+          <w:p>
+            <w:pPr>
+              <w:spacing w:after="0" w:before="0" w:line="276"/>
+            </w:pPr>
+            <w:r>
+              <w:rPr>
+                <w:rFonts w:ascii="Calibri" w:cs="Calibri" w:eastAsia="Calibri" w:hAnsi="Calibri"/>
+                <w:b/>
+                <w:bCs/>
+                <w:color w:val="161A23"/>
+                <w:sz w:val="19"/>
+                <w:szCs w:val="19"/>
+              </w:rPr>
+              <w:t xml:space="preserve">Account — payment history</w:t>
+            </w:r>
+          </w:p>
+        </w:tc>
+        <w:tc>
+          <w:tcPr>
+            <w:tcW w:type="dxa" w:w="6160"/>
+            <w:tcBorders>
+              <w:top w:val="single" w:color="DBDFE8" w:sz="2"/>
+              <w:left w:val="none"/>
+              <w:bottom w:val="single" w:color="DBDFE8" w:sz="2"/>
+              <w:right w:val="none"/>
+            </w:tcBorders>
+            <w:tcMar>
+              <w:top w:type="dxa" w:w="90"/>
+              <w:left w:type="dxa" w:w="110"/>
+              <w:bottom w:type="dxa" w:w="90"/>
+              <w:right w:type="dxa" w:w="110"/>
+            </w:tcMar>
+          </w:tcPr>
+          <w:p>
+            <w:pPr>
+              <w:spacing w:after="0" w:before="0" w:line="276"/>
+            </w:pPr>
+            <w:r>
+              <w:rPr>
+                <w:rFonts w:ascii="Consolas" w:cs="Consolas" w:eastAsia="Consolas" w:hAnsi="Consolas"/>
+                <w:color w:val="1B5FD9"/>
+                <w:sz w:val="18"/>
+                <w:szCs w:val="18"/>
+              </w:rPr>
+              <w:t xml:space="preserve">?screen=account&amp;section=billing&amp;tier=pro</w:t>
+            </w:r>
+          </w:p>
+        </w:tc>
+      </w:tr>
+      <w:tr>
+        <w:tc>
+          <w:tcPr>
+            <w:tcW w:type="dxa" w:w="3200"/>
+            <w:tcBorders>
+              <w:top w:val="single" w:color="DBDFE8" w:sz="2"/>
+              <w:left w:val="none"/>
+              <w:bottom w:val="single" w:color="DBDFE8" w:sz="2"/>
+              <w:right w:val="none"/>
+            </w:tcBorders>
+            <w:shd w:fill="F7F8FA" w:color="auto" w:val="clear"/>
+            <w:tcMar>
+              <w:top w:type="dxa" w:w="90"/>
+              <w:left w:type="dxa" w:w="110"/>
+              <w:bottom w:type="dxa" w:w="90"/>
+              <w:right w:type="dxa" w:w="110"/>
+            </w:tcMar>
+          </w:tcPr>
+          <w:p>
+            <w:pPr>
+              <w:spacing w:after="0" w:before="0" w:line="276"/>
+            </w:pPr>
+            <w:r>
+              <w:rPr>
+                <w:rFonts w:ascii="Calibri" w:cs="Calibri" w:eastAsia="Calibri" w:hAnsi="Calibri"/>
+                <w:b/>
+                <w:bCs/>
+                <w:color w:val="161A23"/>
+                <w:sz w:val="19"/>
+                <w:szCs w:val="19"/>
+              </w:rPr>
+              <w:t xml:space="preserve">Account — security</w:t>
+            </w:r>
+          </w:p>
+        </w:tc>
+        <w:tc>
+          <w:tcPr>
+            <w:tcW w:type="dxa" w:w="6160"/>
+            <w:tcBorders>
+              <w:top w:val="single" w:color="DBDFE8" w:sz="2"/>
+              <w:left w:val="none"/>
+              <w:bottom w:val="single" w:color="DBDFE8" w:sz="2"/>
+              <w:right w:val="none"/>
+            </w:tcBorders>
+            <w:shd w:fill="F7F8FA" w:color="auto" w:val="clear"/>
+            <w:tcMar>
+              <w:top w:type="dxa" w:w="90"/>
+              <w:left w:type="dxa" w:w="110"/>
+              <w:bottom w:type="dxa" w:w="90"/>
+              <w:right w:type="dxa" w:w="110"/>
+            </w:tcMar>
+          </w:tcPr>
+          <w:p>
+            <w:pPr>
+              <w:spacing w:after="0" w:before="0" w:line="276"/>
+            </w:pPr>
+            <w:r>
+              <w:rPr>
+                <w:rFonts w:ascii="Consolas" w:cs="Consolas" w:eastAsia="Consolas" w:hAnsi="Consolas"/>
+                <w:color w:val="1B5FD9"/>
+                <w:sz w:val="18"/>
+                <w:szCs w:val="18"/>
+              </w:rPr>
+              <w:t xml:space="preserve">?screen=account&amp;section=security&amp;tier=avod</w:t>
+            </w:r>
+          </w:p>
+        </w:tc>
+      </w:tr>
+      <w:tr>
+        <w:tc>
+          <w:tcPr>
+            <w:tcW w:type="dxa" w:w="3200"/>
+            <w:tcBorders>
+              <w:top w:val="single" w:color="DBDFE8" w:sz="2"/>
+              <w:left w:val="none"/>
+              <w:bottom w:val="single" w:color="DBDFE8" w:sz="2"/>
+              <w:right w:val="none"/>
+            </w:tcBorders>
+            <w:tcMar>
+              <w:top w:type="dxa" w:w="90"/>
+              <w:left w:type="dxa" w:w="110"/>
+              <w:bottom w:type="dxa" w:w="90"/>
+              <w:right w:type="dxa" w:w="110"/>
+            </w:tcMar>
+          </w:tcPr>
+          <w:p>
+            <w:pPr>
+              <w:spacing w:after="0" w:before="0" w:line="276"/>
+            </w:pPr>
+            <w:r>
+              <w:rPr>
+                <w:rFonts w:ascii="Calibri" w:cs="Calibri" w:eastAsia="Calibri" w:hAnsi="Calibri"/>
+                <w:b/>
+                <w:bCs/>
+                <w:color w:val="161A23"/>
+                <w:sz w:val="19"/>
+                <w:szCs w:val="19"/>
+              </w:rPr>
+              <w:t xml:space="preserve">Account — profile</w:t>
+            </w:r>
+          </w:p>
+        </w:tc>
+        <w:tc>
+          <w:tcPr>
+            <w:tcW w:type="dxa" w:w="6160"/>
+            <w:tcBorders>
+              <w:top w:val="single" w:color="DBDFE8" w:sz="2"/>
+              <w:left w:val="none"/>
+              <w:bottom w:val="single" w:color="DBDFE8" w:sz="2"/>
+              <w:right w:val="none"/>
+            </w:tcBorders>
+            <w:tcMar>
+              <w:top w:type="dxa" w:w="90"/>
+              <w:left w:type="dxa" w:w="110"/>
+              <w:bottom w:type="dxa" w:w="90"/>
+              <w:right w:type="dxa" w:w="110"/>
+            </w:tcMar>
+          </w:tcPr>
+          <w:p>
+            <w:pPr>
+              <w:spacing w:after="0" w:before="0" w:line="276"/>
+            </w:pPr>
+            <w:r>
+              <w:rPr>
+                <w:rFonts w:ascii="Consolas" w:cs="Consolas" w:eastAsia="Consolas" w:hAnsi="Consolas"/>
+                <w:color w:val="1B5FD9"/>
+                <w:sz w:val="18"/>
+                <w:szCs w:val="18"/>
+              </w:rPr>
+              <w:t xml:space="preserve">?screen=account&amp;section=profile&amp;tier=avod</w:t>
+            </w:r>
+          </w:p>
+        </w:tc>
+      </w:tr>
+      <w:tr>
+        <w:tc>
+          <w:tcPr>
+            <w:tcW w:type="dxa" w:w="3200"/>
+            <w:tcBorders>
+              <w:top w:val="single" w:color="DBDFE8" w:sz="2"/>
+              <w:left w:val="none"/>
+              <w:bottom w:val="single" w:color="DBDFE8" w:sz="2"/>
+              <w:right w:val="none"/>
+            </w:tcBorders>
+            <w:shd w:fill="F7F8FA" w:color="auto" w:val="clear"/>
+            <w:tcMar>
+              <w:top w:type="dxa" w:w="90"/>
+              <w:left w:type="dxa" w:w="110"/>
+              <w:bottom w:type="dxa" w:w="90"/>
+              <w:right w:type="dxa" w:w="110"/>
+            </w:tcMar>
+          </w:tcPr>
+          <w:p>
+            <w:pPr>
+              <w:spacing w:after="0" w:before="0" w:line="276"/>
+            </w:pPr>
+            <w:r>
+              <w:rPr>
+                <w:rFonts w:ascii="Calibri" w:cs="Calibri" w:eastAsia="Calibri" w:hAnsi="Calibri"/>
+                <w:b/>
+                <w:bCs/>
+                <w:color w:val="161A23"/>
+                <w:sz w:val="19"/>
+                <w:szCs w:val="19"/>
+              </w:rPr>
+              <w:t xml:space="preserve">Account — My List</w:t>
+            </w:r>
+          </w:p>
+        </w:tc>
+        <w:tc>
+          <w:tcPr>
+            <w:tcW w:type="dxa" w:w="6160"/>
+            <w:tcBorders>
+              <w:top w:val="single" w:color="DBDFE8" w:sz="2"/>
+              <w:left w:val="none"/>
+              <w:bottom w:val="single" w:color="DBDFE8" w:sz="2"/>
+              <w:right w:val="none"/>
+            </w:tcBorders>
+            <w:shd w:fill="F7F8FA" w:color="auto" w:val="clear"/>
+            <w:tcMar>
+              <w:top w:type="dxa" w:w="90"/>
+              <w:left w:type="dxa" w:w="110"/>
+              <w:bottom w:type="dxa" w:w="90"/>
+              <w:right w:type="dxa" w:w="110"/>
+            </w:tcMar>
+          </w:tcPr>
+          <w:p>
+            <w:pPr>
+              <w:spacing w:after="0" w:before="0" w:line="276"/>
+            </w:pPr>
+            <w:r>
+              <w:rPr>
+                <w:rFonts w:ascii="Consolas" w:cs="Consolas" w:eastAsia="Consolas" w:hAnsi="Consolas"/>
+                <w:color w:val="1B5FD9"/>
+                <w:sz w:val="18"/>
+                <w:szCs w:val="18"/>
+              </w:rPr>
+              <w:t xml:space="preserve">?screen=account&amp;section=mylist&amp;tier=avod</w:t>
+            </w:r>
+          </w:p>
+        </w:tc>
+      </w:tr>
+      <w:tr>
+        <w:tc>
+          <w:tcPr>
+            <w:tcW w:type="dxa" w:w="3200"/>
+            <w:tcBorders>
+              <w:top w:val="single" w:color="DBDFE8" w:sz="2"/>
+              <w:left w:val="none"/>
+              <w:bottom w:val="single" w:color="DBDFE8" w:sz="2"/>
+              <w:right w:val="none"/>
+            </w:tcBorders>
+            <w:tcMar>
+              <w:top w:type="dxa" w:w="90"/>
+              <w:left w:type="dxa" w:w="110"/>
+              <w:bottom w:type="dxa" w:w="90"/>
+              <w:right w:type="dxa" w:w="110"/>
+            </w:tcMar>
+          </w:tcPr>
+          <w:p>
+            <w:pPr>
+              <w:spacing w:after="0" w:before="0" w:line="276"/>
+            </w:pPr>
+            <w:r>
+              <w:rPr>
+                <w:rFonts w:ascii="Calibri" w:cs="Calibri" w:eastAsia="Calibri" w:hAnsi="Calibri"/>
+                <w:b/>
+                <w:bCs/>
+                <w:color w:val="161A23"/>
+                <w:sz w:val="19"/>
+                <w:szCs w:val="19"/>
+              </w:rPr>
+              <w:t xml:space="preserve">Cancel — retention</w:t>
+            </w:r>
+          </w:p>
+        </w:tc>
+        <w:tc>
+          <w:tcPr>
+            <w:tcW w:type="dxa" w:w="6160"/>
+            <w:tcBorders>
+              <w:top w:val="single" w:color="DBDFE8" w:sz="2"/>
+              <w:left w:val="none"/>
+              <w:bottom w:val="single" w:color="DBDFE8" w:sz="2"/>
+              <w:right w:val="none"/>
+            </w:tcBorders>
+            <w:tcMar>
+              <w:top w:type="dxa" w:w="90"/>
+              <w:left w:type="dxa" w:w="110"/>
+              <w:bottom w:type="dxa" w:w="90"/>
+              <w:right w:type="dxa" w:w="110"/>
+            </w:tcMar>
+          </w:tcPr>
+          <w:p>
+            <w:pPr>
+              <w:spacing w:after="0" w:before="0" w:line="276"/>
+            </w:pPr>
+            <w:r>
+              <w:rPr>
+                <w:rFonts w:ascii="Consolas" w:cs="Consolas" w:eastAsia="Consolas" w:hAnsi="Consolas"/>
+                <w:color w:val="1B5FD9"/>
+                <w:sz w:val="18"/>
+                <w:szCs w:val="18"/>
+              </w:rPr>
+              <w:t xml:space="preserve">?screen=account&amp;section=cancelConfirm&amp;tier=pro</w:t>
+            </w:r>
+          </w:p>
+        </w:tc>
+      </w:tr>
+      <w:tr>
+        <w:tc>
+          <w:tcPr>
+            <w:tcW w:type="dxa" w:w="3200"/>
+            <w:tcBorders>
+              <w:top w:val="single" w:color="DBDFE8" w:sz="2"/>
+              <w:left w:val="none"/>
+              <w:bottom w:val="single" w:color="DBDFE8" w:sz="2"/>
+              <w:right w:val="none"/>
+            </w:tcBorders>
+            <w:shd w:fill="F7F8FA" w:color="auto" w:val="clear"/>
+            <w:tcMar>
+              <w:top w:type="dxa" w:w="90"/>
+              <w:left w:type="dxa" w:w="110"/>
+              <w:bottom w:type="dxa" w:w="90"/>
+              <w:right w:type="dxa" w:w="110"/>
+            </w:tcMar>
+          </w:tcPr>
+          <w:p>
+            <w:pPr>
+              <w:spacing w:after="0" w:before="0" w:line="276"/>
+            </w:pPr>
+            <w:r>
+              <w:rPr>
+                <w:rFonts w:ascii="Calibri" w:cs="Calibri" w:eastAsia="Calibri" w:hAnsi="Calibri"/>
+                <w:b/>
+                <w:bCs/>
+                <w:color w:val="161A23"/>
+                <w:sz w:val="19"/>
+                <w:szCs w:val="19"/>
+              </w:rPr>
+              <w:t xml:space="preserve">Cancel — done + survey</w:t>
+            </w:r>
+          </w:p>
+        </w:tc>
+        <w:tc>
+          <w:tcPr>
+            <w:tcW w:type="dxa" w:w="6160"/>
+            <w:tcBorders>
+              <w:top w:val="single" w:color="DBDFE8" w:sz="2"/>
+              <w:left w:val="none"/>
+              <w:bottom w:val="single" w:color="DBDFE8" w:sz="2"/>
+              <w:right w:val="none"/>
+            </w:tcBorders>
+            <w:shd w:fill="F7F8FA" w:color="auto" w:val="clear"/>
+            <w:tcMar>
+              <w:top w:type="dxa" w:w="90"/>
+              <w:left w:type="dxa" w:w="110"/>
+              <w:bottom w:type="dxa" w:w="90"/>
+              <w:right w:type="dxa" w:w="110"/>
+            </w:tcMar>
+          </w:tcPr>
+          <w:p>
+            <w:pPr>
+              <w:spacing w:after="0" w:before="0" w:line="276"/>
+            </w:pPr>
+            <w:r>
+              <w:rPr>
+                <w:rFonts w:ascii="Consolas" w:cs="Consolas" w:eastAsia="Consolas" w:hAnsi="Consolas"/>
+                <w:color w:val="1B5FD9"/>
+                <w:sz w:val="18"/>
+                <w:szCs w:val="18"/>
+              </w:rPr>
+              <w:t xml:space="preserve">?screen=account&amp;section=cancelDone&amp;tier=pro</w:t>
+            </w:r>
+          </w:p>
+        </w:tc>
+      </w:tr>
+      <w:tr>
+        <w:tc>
+          <w:tcPr>
+            <w:tcW w:type="dxa" w:w="3200"/>
+            <w:tcBorders>
+              <w:top w:val="single" w:color="DBDFE8" w:sz="2"/>
+              <w:left w:val="none"/>
+              <w:bottom w:val="single" w:color="DBDFE8" w:sz="2"/>
+              <w:right w:val="none"/>
+            </w:tcBorders>
+            <w:tcMar>
+              <w:top w:type="dxa" w:w="90"/>
+              <w:left w:type="dxa" w:w="110"/>
+              <w:bottom w:type="dxa" w:w="90"/>
+              <w:right w:type="dxa" w:w="110"/>
+            </w:tcMar>
+          </w:tcPr>
+          <w:p>
+            <w:pPr>
+              <w:spacing w:after="0" w:before="0" w:line="276"/>
+            </w:pPr>
+            <w:r>
+              <w:rPr>
+                <w:rFonts w:ascii="Calibri" w:cs="Calibri" w:eastAsia="Calibri" w:hAnsi="Calibri"/>
+                <w:b/>
+                <w:bCs/>
+                <w:color w:val="161A23"/>
+                <w:sz w:val="19"/>
+                <w:szCs w:val="19"/>
+              </w:rPr>
+              <w:t xml:space="preserve">Delete — identity</w:t>
+            </w:r>
+          </w:p>
+        </w:tc>
+        <w:tc>
+          <w:tcPr>
+            <w:tcW w:type="dxa" w:w="6160"/>
+            <w:tcBorders>
+              <w:top w:val="single" w:color="DBDFE8" w:sz="2"/>
+              <w:left w:val="none"/>
+              <w:bottom w:val="single" w:color="DBDFE8" w:sz="2"/>
+              <w:right w:val="none"/>
+            </w:tcBorders>
+            <w:tcMar>
+              <w:top w:type="dxa" w:w="90"/>
+              <w:left w:type="dxa" w:w="110"/>
+              <w:bottom w:type="dxa" w:w="90"/>
+              <w:right w:type="dxa" w:w="110"/>
+            </w:tcMar>
+          </w:tcPr>
+          <w:p>
+            <w:pPr>
+              <w:spacing w:after="0" w:before="0" w:line="276"/>
+            </w:pPr>
+            <w:r>
+              <w:rPr>
+                <w:rFonts w:ascii="Consolas" w:cs="Consolas" w:eastAsia="Consolas" w:hAnsi="Consolas"/>
+                <w:color w:val="1B5FD9"/>
+                <w:sz w:val="18"/>
+                <w:szCs w:val="18"/>
+              </w:rPr>
+              <w:t xml:space="preserve">?screen=account&amp;section=deleteIdentity&amp;tier=avod</w:t>
+            </w:r>
+          </w:p>
+        </w:tc>
+      </w:tr>
+      <w:tr>
+        <w:tc>
+          <w:tcPr>
+            <w:tcW w:type="dxa" w:w="3200"/>
+            <w:tcBorders>
+              <w:top w:val="single" w:color="DBDFE8" w:sz="2"/>
+              <w:left w:val="none"/>
+              <w:bottom w:val="single" w:color="DBDFE8" w:sz="2"/>
+              <w:right w:val="none"/>
+            </w:tcBorders>
+            <w:shd w:fill="F7F8FA" w:color="auto" w:val="clear"/>
+            <w:tcMar>
+              <w:top w:type="dxa" w:w="90"/>
+              <w:left w:type="dxa" w:w="110"/>
+              <w:bottom w:type="dxa" w:w="90"/>
+              <w:right w:type="dxa" w:w="110"/>
+            </w:tcMar>
+          </w:tcPr>
+          <w:p>
+            <w:pPr>
+              <w:spacing w:after="0" w:before="0" w:line="276"/>
+            </w:pPr>
+            <w:r>
+              <w:rPr>
+                <w:rFonts w:ascii="Calibri" w:cs="Calibri" w:eastAsia="Calibri" w:hAnsi="Calibri"/>
+                <w:b/>
+                <w:bCs/>
+                <w:color w:val="161A23"/>
+                <w:sz w:val="19"/>
+                <w:szCs w:val="19"/>
+              </w:rPr>
+              <w:t xml:space="preserve">Delete — verify</w:t>
+            </w:r>
+          </w:p>
+        </w:tc>
+        <w:tc>
+          <w:tcPr>
+            <w:tcW w:type="dxa" w:w="6160"/>
+            <w:tcBorders>
+              <w:top w:val="single" w:color="DBDFE8" w:sz="2"/>
+              <w:left w:val="none"/>
+              <w:bottom w:val="single" w:color="DBDFE8" w:sz="2"/>
+              <w:right w:val="none"/>
+            </w:tcBorders>
+            <w:shd w:fill="F7F8FA" w:color="auto" w:val="clear"/>
+            <w:tcMar>
+              <w:top w:type="dxa" w:w="90"/>
+              <w:left w:type="dxa" w:w="110"/>
+              <w:bottom w:type="dxa" w:w="90"/>
+              <w:right w:type="dxa" w:w="110"/>
+            </w:tcMar>
+          </w:tcPr>
+          <w:p>
+            <w:pPr>
+              <w:spacing w:after="0" w:before="0" w:line="276"/>
+            </w:pPr>
+            <w:r>
+              <w:rPr>
+                <w:rFonts w:ascii="Consolas" w:cs="Consolas" w:eastAsia="Consolas" w:hAnsi="Consolas"/>
+                <w:color w:val="1B5FD9"/>
+                <w:sz w:val="18"/>
+                <w:szCs w:val="18"/>
+              </w:rPr>
+              <w:t xml:space="preserve">?screen=account&amp;section=deleteVerify&amp;tier=avod</w:t>
+            </w:r>
+          </w:p>
+        </w:tc>
+      </w:tr>
+      <w:tr>
+        <w:tc>
+          <w:tcPr>
+            <w:tcW w:type="dxa" w:w="3200"/>
+            <w:tcBorders>
+              <w:top w:val="single" w:color="DBDFE8" w:sz="2"/>
+              <w:left w:val="none"/>
+              <w:bottom w:val="single" w:color="DBDFE8" w:sz="2"/>
+              <w:right w:val="none"/>
+            </w:tcBorders>
+            <w:tcMar>
+              <w:top w:type="dxa" w:w="90"/>
+              <w:left w:type="dxa" w:w="110"/>
+              <w:bottom w:type="dxa" w:w="90"/>
+              <w:right w:type="dxa" w:w="110"/>
+            </w:tcMar>
+          </w:tcPr>
+          <w:p>
+            <w:pPr>
+              <w:spacing w:after="0" w:before="0" w:line="276"/>
+            </w:pPr>
+            <w:r>
+              <w:rPr>
+                <w:rFonts w:ascii="Calibri" w:cs="Calibri" w:eastAsia="Calibri" w:hAnsi="Calibri"/>
+                <w:b/>
+                <w:bCs/>
+                <w:color w:val="161A23"/>
+                <w:sz w:val="19"/>
+                <w:szCs w:val="19"/>
+              </w:rPr>
+              <w:t xml:space="preserve">Delete — confirm</w:t>
+            </w:r>
+          </w:p>
+        </w:tc>
+        <w:tc>
+          <w:tcPr>
+            <w:tcW w:type="dxa" w:w="6160"/>
+            <w:tcBorders>
+              <w:top w:val="single" w:color="DBDFE8" w:sz="2"/>
+              <w:left w:val="none"/>
+              <w:bottom w:val="single" w:color="DBDFE8" w:sz="2"/>
+              <w:right w:val="none"/>
+            </w:tcBorders>
+            <w:tcMar>
+              <w:top w:type="dxa" w:w="90"/>
+              <w:left w:type="dxa" w:w="110"/>
+              <w:bottom w:type="dxa" w:w="90"/>
+              <w:right w:type="dxa" w:w="110"/>
+            </w:tcMar>
+          </w:tcPr>
+          <w:p>
+            <w:pPr>
+              <w:spacing w:after="0" w:before="0" w:line="276"/>
+            </w:pPr>
+            <w:r>
+              <w:rPr>
+                <w:rFonts w:ascii="Consolas" w:cs="Consolas" w:eastAsia="Consolas" w:hAnsi="Consolas"/>
+                <w:color w:val="1B5FD9"/>
+                <w:sz w:val="18"/>
+                <w:szCs w:val="18"/>
+              </w:rPr>
+              <w:t xml:space="preserve">?screen=account&amp;section=deleteConfirm&amp;tier=avod</w:t>
+            </w:r>
+          </w:p>
+        </w:tc>
+      </w:tr>
+      <w:tr>
+        <w:tc>
+          <w:tcPr>
+            <w:tcW w:type="dxa" w:w="3200"/>
+            <w:tcBorders>
+              <w:top w:val="single" w:color="DBDFE8" w:sz="2"/>
+              <w:left w:val="none"/>
+              <w:bottom w:val="single" w:color="DBDFE8" w:sz="2"/>
+              <w:right w:val="none"/>
+            </w:tcBorders>
+            <w:shd w:fill="F7F8FA" w:color="auto" w:val="clear"/>
+            <w:tcMar>
+              <w:top w:type="dxa" w:w="90"/>
+              <w:left w:type="dxa" w:w="110"/>
+              <w:bottom w:type="dxa" w:w="90"/>
+              <w:right w:type="dxa" w:w="110"/>
+            </w:tcMar>
+          </w:tcPr>
+          <w:p>
+            <w:pPr>
+              <w:spacing w:after="0" w:before="0" w:line="276"/>
+            </w:pPr>
+            <w:r>
+              <w:rPr>
+                <w:rFonts w:ascii="Calibri" w:cs="Calibri" w:eastAsia="Calibri" w:hAnsi="Calibri"/>
+                <w:b/>
+                <w:bCs/>
+                <w:color w:val="161A23"/>
+                <w:sz w:val="19"/>
+                <w:szCs w:val="19"/>
+              </w:rPr>
+              <w:t xml:space="preserve">Subscribe — plans</w:t>
+            </w:r>
+          </w:p>
+        </w:tc>
+        <w:tc>
+          <w:tcPr>
+            <w:tcW w:type="dxa" w:w="6160"/>
+            <w:tcBorders>
+              <w:top w:val="single" w:color="DBDFE8" w:sz="2"/>
+              <w:left w:val="none"/>
+              <w:bottom w:val="single" w:color="DBDFE8" w:sz="2"/>
+              <w:right w:val="none"/>
+            </w:tcBorders>
+            <w:shd w:fill="F7F8FA" w:color="auto" w:val="clear"/>
+            <w:tcMar>
+              <w:top w:type="dxa" w:w="90"/>
+              <w:left w:type="dxa" w:w="110"/>
+              <w:bottom w:type="dxa" w:w="90"/>
+              <w:right w:type="dxa" w:w="110"/>
+            </w:tcMar>
+          </w:tcPr>
+          <w:p>
+            <w:pPr>
+              <w:spacing w:after="0" w:before="0" w:line="276"/>
+            </w:pPr>
+            <w:r>
+              <w:rPr>
+                <w:rFonts w:ascii="Consolas" w:cs="Consolas" w:eastAsia="Consolas" w:hAnsi="Consolas"/>
+                <w:color w:val="1B5FD9"/>
+                <w:sz w:val="18"/>
+                <w:szCs w:val="18"/>
+              </w:rPr>
+              <w:t xml:space="preserve">?screen=pro&amp;step=plans</w:t>
+            </w:r>
+          </w:p>
+        </w:tc>
+      </w:tr>
+      <w:tr>
+        <w:tc>
+          <w:tcPr>
+            <w:tcW w:type="dxa" w:w="3200"/>
+            <w:tcBorders>
+              <w:top w:val="single" w:color="DBDFE8" w:sz="2"/>
+              <w:left w:val="none"/>
+              <w:bottom w:val="single" w:color="DBDFE8" w:sz="2"/>
+              <w:right w:val="none"/>
+            </w:tcBorders>
+            <w:tcMar>
+              <w:top w:type="dxa" w:w="90"/>
+              <w:left w:type="dxa" w:w="110"/>
+              <w:bottom w:type="dxa" w:w="90"/>
+              <w:right w:type="dxa" w:w="110"/>
+            </w:tcMar>
+          </w:tcPr>
+          <w:p>
+            <w:pPr>
+              <w:spacing w:after="0" w:before="0" w:line="276"/>
+            </w:pPr>
+            <w:r>
+              <w:rPr>
+                <w:rFonts w:ascii="Calibri" w:cs="Calibri" w:eastAsia="Calibri" w:hAnsi="Calibri"/>
+                <w:b/>
+                <w:bCs/>
+                <w:color w:val="161A23"/>
+                <w:sz w:val="19"/>
+                <w:szCs w:val="19"/>
+              </w:rPr>
+              <w:t xml:space="preserve">Subscribe — payment method</w:t>
+            </w:r>
+          </w:p>
+        </w:tc>
+        <w:tc>
+          <w:tcPr>
+            <w:tcW w:type="dxa" w:w="6160"/>
+            <w:tcBorders>
+              <w:top w:val="single" w:color="DBDFE8" w:sz="2"/>
+              <w:left w:val="none"/>
+              <w:bottom w:val="single" w:color="DBDFE8" w:sz="2"/>
+              <w:right w:val="none"/>
+            </w:tcBorders>
+            <w:tcMar>
+              <w:top w:type="dxa" w:w="90"/>
+              <w:left w:type="dxa" w:w="110"/>
+              <w:bottom w:type="dxa" w:w="90"/>
+              <w:right w:type="dxa" w:w="110"/>
+            </w:tcMar>
+          </w:tcPr>
+          <w:p>
+            <w:pPr>
+              <w:spacing w:after="0" w:before="0" w:line="276"/>
+            </w:pPr>
+            <w:r>
+              <w:rPr>
+                <w:rFonts w:ascii="Consolas" w:cs="Consolas" w:eastAsia="Consolas" w:hAnsi="Consolas"/>
+                <w:color w:val="1B5FD9"/>
+                <w:sz w:val="18"/>
+                <w:szCs w:val="18"/>
+              </w:rPr>
+              <w:t xml:space="preserve">?screen=pro&amp;step=method</w:t>
+            </w:r>
+          </w:p>
+        </w:tc>
+      </w:tr>
+      <w:tr>
+        <w:tc>
+          <w:tcPr>
+            <w:tcW w:type="dxa" w:w="3200"/>
+            <w:tcBorders>
+              <w:top w:val="single" w:color="DBDFE8" w:sz="2"/>
+              <w:left w:val="none"/>
+              <w:bottom w:val="single" w:color="DBDFE8" w:sz="2"/>
+              <w:right w:val="none"/>
+            </w:tcBorders>
+            <w:shd w:fill="F7F8FA" w:color="auto" w:val="clear"/>
+            <w:tcMar>
+              <w:top w:type="dxa" w:w="90"/>
+              <w:left w:type="dxa" w:w="110"/>
+              <w:bottom w:type="dxa" w:w="90"/>
+              <w:right w:type="dxa" w:w="110"/>
+            </w:tcMar>
+          </w:tcPr>
+          <w:p>
+            <w:pPr>
+              <w:spacing w:after="0" w:before="0" w:line="276"/>
+            </w:pPr>
+            <w:r>
+              <w:rPr>
+                <w:rFonts w:ascii="Calibri" w:cs="Calibri" w:eastAsia="Calibri" w:hAnsi="Calibri"/>
+                <w:b/>
+                <w:bCs/>
+                <w:color w:val="161A23"/>
+                <w:sz w:val="19"/>
+                <w:szCs w:val="19"/>
+              </w:rPr>
+              <w:t xml:space="preserve">Subscribe — card details</w:t>
+            </w:r>
+          </w:p>
+        </w:tc>
+        <w:tc>
+          <w:tcPr>
+            <w:tcW w:type="dxa" w:w="6160"/>
+            <w:tcBorders>
+              <w:top w:val="single" w:color="DBDFE8" w:sz="2"/>
+              <w:left w:val="none"/>
+              <w:bottom w:val="single" w:color="DBDFE8" w:sz="2"/>
+              <w:right w:val="none"/>
+            </w:tcBorders>
+            <w:shd w:fill="F7F8FA" w:color="auto" w:val="clear"/>
+            <w:tcMar>
+              <w:top w:type="dxa" w:w="90"/>
+              <w:left w:type="dxa" w:w="110"/>
+              <w:bottom w:type="dxa" w:w="90"/>
+              <w:right w:type="dxa" w:w="110"/>
+            </w:tcMar>
+          </w:tcPr>
+          <w:p>
+            <w:pPr>
+              <w:spacing w:after="0" w:before="0" w:line="276"/>
+            </w:pPr>
+            <w:r>
+              <w:rPr>
+                <w:rFonts w:ascii="Consolas" w:cs="Consolas" w:eastAsia="Consolas" w:hAnsi="Consolas"/>
+                <w:color w:val="1B5FD9"/>
+                <w:sz w:val="18"/>
+                <w:szCs w:val="18"/>
+              </w:rPr>
+              <w:t xml:space="preserve">?screen=pro&amp;step=details</w:t>
+            </w:r>
+          </w:p>
+        </w:tc>
+      </w:tr>
+      <w:tr>
+        <w:tc>
+          <w:tcPr>
+            <w:tcW w:type="dxa" w:w="3200"/>
+            <w:tcBorders>
+              <w:top w:val="single" w:color="DBDFE8" w:sz="2"/>
+              <w:left w:val="none"/>
+              <w:bottom w:val="single" w:color="DBDFE8" w:sz="2"/>
+              <w:right w:val="none"/>
+            </w:tcBorders>
+            <w:tcMar>
+              <w:top w:type="dxa" w:w="90"/>
+              <w:left w:type="dxa" w:w="110"/>
+              <w:bottom w:type="dxa" w:w="90"/>
+              <w:right w:type="dxa" w:w="110"/>
+            </w:tcMar>
+          </w:tcPr>
+          <w:p>
+            <w:pPr>
+              <w:spacing w:after="0" w:before="0" w:line="276"/>
+            </w:pPr>
+            <w:r>
+              <w:rPr>
+                <w:rFonts w:ascii="Calibri" w:cs="Calibri" w:eastAsia="Calibri" w:hAnsi="Calibri"/>
+                <w:b/>
+                <w:bCs/>
+                <w:color w:val="161A23"/>
+                <w:sz w:val="19"/>
+                <w:szCs w:val="19"/>
+              </w:rPr>
+              <w:t xml:space="preserve">Subscribe — success</w:t>
+            </w:r>
+          </w:p>
+        </w:tc>
+        <w:tc>
+          <w:tcPr>
+            <w:tcW w:type="dxa" w:w="6160"/>
+            <w:tcBorders>
+              <w:top w:val="single" w:color="DBDFE8" w:sz="2"/>
+              <w:left w:val="none"/>
+              <w:bottom w:val="single" w:color="DBDFE8" w:sz="2"/>
+              <w:right w:val="none"/>
+            </w:tcBorders>
+            <w:tcMar>
+              <w:top w:type="dxa" w:w="90"/>
+              <w:left w:type="dxa" w:w="110"/>
+              <w:bottom w:type="dxa" w:w="90"/>
+              <w:right w:type="dxa" w:w="110"/>
+            </w:tcMar>
+          </w:tcPr>
+          <w:p>
+            <w:pPr>
+              <w:spacing w:after="0" w:before="0" w:line="276"/>
+            </w:pPr>
+            <w:r>
+              <w:rPr>
+                <w:rFonts w:ascii="Consolas" w:cs="Consolas" w:eastAsia="Consolas" w:hAnsi="Consolas"/>
+                <w:color w:val="1B5FD9"/>
+                <w:sz w:val="18"/>
+                <w:szCs w:val="18"/>
+              </w:rPr>
+              <w:t xml:space="preserve">?screen=pro&amp;step=done</w:t>
+            </w:r>
+          </w:p>
+        </w:tc>
+      </w:tr>
+      <w:tr>
+        <w:tc>
+          <w:tcPr>
+            <w:tcW w:type="dxa" w:w="3200"/>
+            <w:tcBorders>
+              <w:top w:val="single" w:color="DBDFE8" w:sz="2"/>
+              <w:left w:val="none"/>
+              <w:bottom w:val="single" w:color="DBDFE8" w:sz="2"/>
+              <w:right w:val="none"/>
+            </w:tcBorders>
+            <w:shd w:fill="F7F8FA" w:color="auto" w:val="clear"/>
+            <w:tcMar>
+              <w:top w:type="dxa" w:w="90"/>
+              <w:left w:type="dxa" w:w="110"/>
+              <w:bottom w:type="dxa" w:w="90"/>
+              <w:right w:type="dxa" w:w="110"/>
+            </w:tcMar>
+          </w:tcPr>
+          <w:p>
+            <w:pPr>
+              <w:spacing w:after="0" w:before="0" w:line="276"/>
+            </w:pPr>
+            <w:r>
+              <w:rPr>
+                <w:rFonts w:ascii="Calibri" w:cs="Calibri" w:eastAsia="Calibri" w:hAnsi="Calibri"/>
+                <w:b/>
+                <w:bCs/>
+                <w:color w:val="161A23"/>
+                <w:sz w:val="19"/>
+                <w:szCs w:val="19"/>
+              </w:rPr>
+              <w:t xml:space="preserve">Shop voucher dialog</w:t>
+            </w:r>
+          </w:p>
+        </w:tc>
+        <w:tc>
+          <w:tcPr>
+            <w:tcW w:type="dxa" w:w="6160"/>
+            <w:tcBorders>
+              <w:top w:val="single" w:color="DBDFE8" w:sz="2"/>
+              <w:left w:val="none"/>
+              <w:bottom w:val="single" w:color="DBDFE8" w:sz="2"/>
+              <w:right w:val="none"/>
+            </w:tcBorders>
+            <w:shd w:fill="F7F8FA" w:color="auto" w:val="clear"/>
+            <w:tcMar>
+              <w:top w:type="dxa" w:w="90"/>
+              <w:left w:type="dxa" w:w="110"/>
+              <w:bottom w:type="dxa" w:w="90"/>
+              <w:right w:type="dxa" w:w="110"/>
+            </w:tcMar>
+          </w:tcPr>
+          <w:p>
+            <w:pPr>
+              <w:spacing w:after="0" w:before="0" w:line="276"/>
+            </w:pPr>
+            <w:r>
+              <w:rPr>
+                <w:rFonts w:ascii="Consolas" w:cs="Consolas" w:eastAsia="Consolas" w:hAnsi="Consolas"/>
+                <w:color w:val="1B5FD9"/>
+                <w:sz w:val="18"/>
+                <w:szCs w:val="18"/>
+              </w:rPr>
+              <w:t xml:space="preserve">?screen=voucher&amp;tier=avod</w:t>
+            </w:r>
+          </w:p>
+        </w:tc>
+      </w:tr>
+      <w:tr>
+        <w:tc>
+          <w:tcPr>
+            <w:tcW w:type="dxa" w:w="3200"/>
+            <w:tcBorders>
+              <w:top w:val="single" w:color="DBDFE8" w:sz="2"/>
+              <w:left w:val="none"/>
+              <w:bottom w:val="single" w:color="DBDFE8" w:sz="2"/>
+              <w:right w:val="none"/>
+            </w:tcBorders>
+            <w:tcMar>
+              <w:top w:type="dxa" w:w="90"/>
+              <w:left w:type="dxa" w:w="110"/>
+              <w:bottom w:type="dxa" w:w="90"/>
+              <w:right w:type="dxa" w:w="110"/>
+            </w:tcMar>
+          </w:tcPr>
+          <w:p>
+            <w:pPr>
+              <w:spacing w:after="0" w:before="0" w:line="276"/>
+            </w:pPr>
+            <w:r>
+              <w:rPr>
+                <w:rFonts w:ascii="Calibri" w:cs="Calibri" w:eastAsia="Calibri" w:hAnsi="Calibri"/>
+                <w:b/>
+                <w:bCs/>
+                <w:color w:val="161A23"/>
+                <w:sz w:val="19"/>
+                <w:szCs w:val="19"/>
+              </w:rPr>
+              <w:t xml:space="preserve">Logout confirm dialog</w:t>
+            </w:r>
+          </w:p>
+        </w:tc>
+        <w:tc>
+          <w:tcPr>
+            <w:tcW w:type="dxa" w:w="6160"/>
+            <w:tcBorders>
+              <w:top w:val="single" w:color="DBDFE8" w:sz="2"/>
+              <w:left w:val="none"/>
+              <w:bottom w:val="single" w:color="DBDFE8" w:sz="2"/>
+              <w:right w:val="none"/>
+            </w:tcBorders>
+            <w:tcMar>
+              <w:top w:type="dxa" w:w="90"/>
+              <w:left w:type="dxa" w:w="110"/>
+              <w:bottom w:type="dxa" w:w="90"/>
+              <w:right w:type="dxa" w:w="110"/>
+            </w:tcMar>
+          </w:tcPr>
+          <w:p>
+            <w:pPr>
+              <w:spacing w:after="0" w:before="0" w:line="276"/>
+            </w:pPr>
+            <w:r>
+              <w:rPr>
+                <w:rFonts w:ascii="Consolas" w:cs="Consolas" w:eastAsia="Consolas" w:hAnsi="Consolas"/>
+                <w:color w:val="1B5FD9"/>
+                <w:sz w:val="18"/>
+                <w:szCs w:val="18"/>
+              </w:rPr>
+              <w:t xml:space="preserve">?screen=dialog&amp;d=logout&amp;tier=pro</w:t>
+            </w:r>
+          </w:p>
+        </w:tc>
+      </w:tr>
+      <w:tr>
+        <w:tc>
+          <w:tcPr>
+            <w:tcW w:type="dxa" w:w="3200"/>
+            <w:tcBorders>
+              <w:top w:val="single" w:color="DBDFE8" w:sz="2"/>
+              <w:left w:val="none"/>
+              <w:bottom w:val="single" w:color="DBDFE8" w:sz="2"/>
+              <w:right w:val="none"/>
+            </w:tcBorders>
+            <w:shd w:fill="F7F8FA" w:color="auto" w:val="clear"/>
+            <w:tcMar>
+              <w:top w:type="dxa" w:w="90"/>
+              <w:left w:type="dxa" w:w="110"/>
+              <w:bottom w:type="dxa" w:w="90"/>
+              <w:right w:type="dxa" w:w="110"/>
+            </w:tcMar>
+          </w:tcPr>
+          <w:p>
+            <w:pPr>
+              <w:spacing w:after="0" w:before="0" w:line="276"/>
+            </w:pPr>
+            <w:r>
+              <w:rPr>
+                <w:rFonts w:ascii="Calibri" w:cs="Calibri" w:eastAsia="Calibri" w:hAnsi="Calibri"/>
+                <w:b/>
+                <w:bCs/>
+                <w:color w:val="161A23"/>
+                <w:sz w:val="19"/>
+                <w:szCs w:val="19"/>
+              </w:rPr>
+              <w:t xml:space="preserve">Cancel confirm dialog</w:t>
+            </w:r>
+          </w:p>
+        </w:tc>
+        <w:tc>
+          <w:tcPr>
+            <w:tcW w:type="dxa" w:w="6160"/>
+            <w:tcBorders>
+              <w:top w:val="single" w:color="DBDFE8" w:sz="2"/>
+              <w:left w:val="none"/>
+              <w:bottom w:val="single" w:color="DBDFE8" w:sz="2"/>
+              <w:right w:val="none"/>
+            </w:tcBorders>
+            <w:shd w:fill="F7F8FA" w:color="auto" w:val="clear"/>
+            <w:tcMar>
+              <w:top w:type="dxa" w:w="90"/>
+              <w:left w:type="dxa" w:w="110"/>
+              <w:bottom w:type="dxa" w:w="90"/>
+              <w:right w:type="dxa" w:w="110"/>
+            </w:tcMar>
+          </w:tcPr>
+          <w:p>
+            <w:pPr>
+              <w:spacing w:after="0" w:before="0" w:line="276"/>
+            </w:pPr>
+            <w:r>
+              <w:rPr>
+                <w:rFonts w:ascii="Consolas" w:cs="Consolas" w:eastAsia="Consolas" w:hAnsi="Consolas"/>
+                <w:color w:val="1B5FD9"/>
+                <w:sz w:val="18"/>
+                <w:szCs w:val="18"/>
+              </w:rPr>
+              <w:t xml:space="preserve">?screen=dialog&amp;d=cancel&amp;tier=pro</w:t>
+            </w:r>
+          </w:p>
+        </w:tc>
+      </w:tr>
+    </w:tbl>
+    <w:p>
+      <w:pPr>
+        <w:spacing w:after="200" w:before="120" w:line="276"/>
+      </w:pPr>
+      <w:r>
+        <w:rPr>
+          <w:rFonts w:ascii="Calibri" w:cs="Calibri" w:eastAsia="Calibri" w:hAnsi="Calibri"/>
+          <w:i/>
+          <w:iCs/>
+          <w:color w:val="737B8E"/>
+          <w:sz w:val="18"/>
+          <w:szCs w:val="18"/>
+        </w:rPr>
+        <w:t xml:space="preserve">Repeat the set at each breakpoint by resizing the plugin viewport to 1440, 900 and 390.</w:t>
       </w:r>
     </w:p>
     <w:p>

</xml_diff>